<commit_message>
- documentation cleanups - despeckle now fills in single row mutes, too - update zip file
</commit_message>
<xml_diff>
--- a/dist/VGMComp2.docx
+++ b/dist/VGMComp2.docx
@@ -905,6 +905,18 @@
       <w:r>
         <w:t xml:space="preserve">A very similar format is used when using the "prepare4sn", "prepare4ay" and “prepare4sid” tools, except these tools will emit all four channels in a single row (the fourth channel for SID will be a dummy channel). The filename does not require metadata in this case. </w:t>
       </w:r>
+    </w:p>
+    <w:p>
+      <w:pPr>
+        <w:spacing w:after="33" w:line="356" w:lineRule="auto"/>
+        <w:ind w:left="9" w:right="13"/>
+      </w:pPr>
+    </w:p>
+    <w:p>
+      <w:pPr>
+        <w:spacing w:after="33" w:line="356" w:lineRule="auto"/>
+        <w:ind w:left="9" w:right="13"/>
+      </w:pPr>
       <w:r>
         <w:rPr>
           <w:b/>
@@ -940,18 +952,30 @@
         </w:rPr>
         <w:t xml:space="preserve">Test tools </w:t>
       </w:r>
+      <w:r>
+        <w:rPr>
+          <w:b/>
+          <w:i/>
+        </w:rPr>
+        <w:br/>
+      </w:r>
       <w:proofErr w:type="spellStart"/>
       <w:r>
         <w:t>vgm_id</w:t>
       </w:r>
       <w:proofErr w:type="spellEnd"/>
       <w:r>
-        <w:t xml:space="preserve">  </w:t>
-      </w:r>
-      <w:r>
-        <w:tab/>
-        <w:t xml:space="preserve">- identify the known sound chips in a VGM </w:t>
-      </w:r>
+        <w:t xml:space="preserve">  - identify the known sound chips in a VGM </w:t>
+      </w:r>
+    </w:p>
+    <w:p>
+      <w:pPr>
+        <w:tabs>
+          <w:tab w:val="center" w:pos="4748"/>
+        </w:tabs>
+        <w:spacing w:after="24"/>
+        <w:ind w:left="0"/>
+      </w:pPr>
       <w:proofErr w:type="spellStart"/>
       <w:r>
         <w:t>testPlayer</w:t>
@@ -960,61 +984,101 @@
       <w:r>
         <w:t xml:space="preserve"> </w:t>
       </w:r>
-    </w:p>
-    <w:p>
-      <w:pPr>
-        <w:numPr>
-          <w:ilvl w:val="0"/>
-          <w:numId w:val="4"/>
-        </w:numPr>
-        <w:spacing w:after="27"/>
-        <w:ind w:right="1201" w:hanging="137"/>
-      </w:pPr>
-      <w:r>
-        <w:t xml:space="preserve">play a PSG or AY converted song without channel limits psg2vgm </w:t>
-      </w:r>
-    </w:p>
-    <w:p>
-      <w:pPr>
-        <w:numPr>
-          <w:ilvl w:val="0"/>
-          <w:numId w:val="4"/>
-        </w:numPr>
-        <w:spacing w:after="11"/>
-        <w:ind w:right="1201" w:hanging="137"/>
-      </w:pPr>
-      <w:r>
-        <w:t xml:space="preserve">convert PSG data back to a VGM  psg2soundlist - convert PSG data into a TI ROM Sound List  </w:t>
-      </w:r>
+      <w:r>
+        <w:t xml:space="preserve">- </w:t>
+      </w:r>
+      <w:r>
+        <w:t xml:space="preserve">play a PSG or AY converted song without channel limits </w:t>
+      </w:r>
+    </w:p>
+    <w:p>
+      <w:pPr>
+        <w:tabs>
+          <w:tab w:val="center" w:pos="4748"/>
+        </w:tabs>
+        <w:spacing w:after="24"/>
+        <w:ind w:left="0"/>
+      </w:pPr>
+      <w:r>
+        <w:t xml:space="preserve">psg2vgm </w:t>
+      </w:r>
+      <w:r>
+        <w:t xml:space="preserve">- </w:t>
+      </w:r>
+      <w:r>
+        <w:t xml:space="preserve">convert PSG data back to a VGM  </w:t>
+      </w:r>
+    </w:p>
+    <w:p>
+      <w:pPr>
+        <w:tabs>
+          <w:tab w:val="center" w:pos="4748"/>
+        </w:tabs>
+        <w:spacing w:after="24"/>
+        <w:ind w:left="0"/>
+      </w:pPr>
+      <w:r>
+        <w:t xml:space="preserve">psg2soundlist - convert PSG data into a TI ROM Sound List  </w:t>
+      </w:r>
+    </w:p>
+    <w:p>
+      <w:pPr>
+        <w:tabs>
+          <w:tab w:val="center" w:pos="4748"/>
+        </w:tabs>
+        <w:spacing w:after="24"/>
+        <w:ind w:left="0"/>
+      </w:pPr>
       <w:proofErr w:type="spellStart"/>
       <w:r>
         <w:t>analyzeStream</w:t>
       </w:r>
       <w:proofErr w:type="spellEnd"/>
       <w:r>
-        <w:t xml:space="preserve"> - dump contents of a single stream from an SBF packed  </w:t>
-      </w:r>
-    </w:p>
-    <w:p>
-      <w:pPr>
-        <w:ind w:left="9" w:right="13"/>
-      </w:pPr>
-      <w:r>
-        <w:t xml:space="preserve">file  </w:t>
+        <w:t xml:space="preserve"> - dump contents of a single stream from an SBF packed file  </w:t>
       </w:r>
     </w:p>
     <w:p>
       <w:pPr>
         <w:spacing w:after="0"/>
         <w:ind w:left="9" w:right="245"/>
-      </w:pPr>
-      <w:r>
         <w:rPr>
           <w:b/>
           <w:i/>
         </w:rPr>
+      </w:pPr>
+    </w:p>
+    <w:p>
+      <w:pPr>
+        <w:spacing w:after="0"/>
+        <w:ind w:left="9" w:right="245"/>
+        <w:rPr>
+          <w:b/>
+          <w:i/>
+        </w:rPr>
+      </w:pPr>
+      <w:r>
+        <w:rPr>
+          <w:b/>
+          <w:i/>
+        </w:rPr>
         <w:t xml:space="preserve">Conversion tools </w:t>
       </w:r>
+    </w:p>
+    <w:p>
+      <w:pPr>
+        <w:spacing w:after="0"/>
+        <w:ind w:left="9" w:right="245"/>
+      </w:pPr>
+      <w:r>
+        <w:t>midi2psg.py – convert MIDI files to PSG format (requires Python)</w:t>
+      </w:r>
+    </w:p>
+    <w:p>
+      <w:pPr>
+        <w:spacing w:after="0"/>
+        <w:ind w:left="9" w:right="245"/>
+      </w:pPr>
       <w:r>
         <w:t xml:space="preserve">mod2psg - convert </w:t>
       </w:r>
@@ -1024,7 +1088,25 @@
       </w:r>
       <w:proofErr w:type="spellEnd"/>
       <w:r>
-        <w:t xml:space="preserve"> style MODs and MIDI to PSG format (many formats ok) playlist2psg - convert TI playlist data (in binary format) to PSG format sid2psg - convert 6510-based SID files to PSG format vgm_ay2psg - extract AY audio data from a VGM and export to PSG format (dual chip ok) vgm_gb2psg - extract Gameboy data from a VGM and export to PSG format (dual chip ok) vgm_md2psg - extract </w:t>
+        <w:t xml:space="preserve"> style MODs and MIDI to PSG format (many formats ok) playlist2psg - convert TI playlist data (in binary format) to PSG format </w:t>
+      </w:r>
+    </w:p>
+    <w:p>
+      <w:pPr>
+        <w:spacing w:after="0"/>
+        <w:ind w:left="9" w:right="245"/>
+      </w:pPr>
+      <w:r>
+        <w:t xml:space="preserve">sid2psg - convert 6510-based SID files to PSG format </w:t>
+      </w:r>
+    </w:p>
+    <w:p>
+      <w:pPr>
+        <w:spacing w:after="0"/>
+        <w:ind w:left="9" w:right="245"/>
+      </w:pPr>
+      <w:r>
+        <w:t xml:space="preserve">vgm_ay2psg - extract AY audio data from a VGM and export to PSG format (dual chip ok) vgm_gb2psg - extract Gameboy data from a VGM and export to PSG format (dual chip ok) vgm_md2psg - extract </w:t>
       </w:r>
       <w:proofErr w:type="spellStart"/>
       <w:r>
@@ -1032,44 +1114,52 @@
       </w:r>
       <w:proofErr w:type="spellEnd"/>
       <w:r>
-        <w:t xml:space="preserve">/Genesis data (YM2612 and SN PSG) from a VGM vgm_nes2psg - extract NES APU data from a VGM and export to PSG format (dual chip ok) vgm_pokey2psg - extract Pokey data from a  </w:t>
-      </w:r>
-    </w:p>
-    <w:p>
-      <w:pPr>
-        <w:spacing w:after="1"/>
-        <w:ind w:left="9" w:right="13"/>
-      </w:pPr>
-      <w:r>
-        <w:t xml:space="preserve">VGM and export to PSG format (dual chip ok) vgm_psg2psg - extract PSG audio data from a </w:t>
-      </w:r>
-    </w:p>
-    <w:p>
-      <w:pPr>
-        <w:ind w:left="9" w:right="13"/>
-      </w:pPr>
-      <w:r>
-        <w:t xml:space="preserve">VGM and export to PSG format (dual chip ok) voice2psg - convert a voice sample to PSG data  </w:t>
-      </w:r>
+        <w:t xml:space="preserve">/Genesis data (YM2612 and SN PSG) from a VGM vgm_nes2psg - extract NES APU data from a VGM and export to PSG format (dual chip ok) vgm_pokey2psg - extract Pokey data from a VGM and export to PSG format (dual chip ok) vgm_psg2psg - extract PSG audio data from a VGM and export to PSG format (dual chip ok) voice2psg - convert a voice sample to PSG data  </w:t>
+      </w:r>
+    </w:p>
+    <w:p>
+      <w:pPr>
+        <w:spacing w:after="0"/>
+        <w:ind w:left="9" w:right="245"/>
+      </w:pPr>
     </w:p>
     <w:p>
       <w:pPr>
         <w:ind w:left="9" w:right="2147"/>
-      </w:pPr>
-      <w:r>
         <w:rPr>
           <w:b/>
           <w:i/>
         </w:rPr>
+      </w:pPr>
+      <w:r>
+        <w:rPr>
+          <w:b/>
+          <w:i/>
+        </w:rPr>
+        <w:lastRenderedPageBreak/>
         <w:t xml:space="preserve">Editing Tools </w:t>
       </w:r>
+    </w:p>
+    <w:p>
+      <w:pPr>
+        <w:ind w:left="9" w:right="2147"/>
+      </w:pPr>
       <w:proofErr w:type="spellStart"/>
       <w:r>
         <w:t>arptones</w:t>
       </w:r>
       <w:proofErr w:type="spellEnd"/>
       <w:r>
-        <w:t xml:space="preserve"> - merge two (normally tone) channels with arpeggio arp3tones - merge three (normally tone) channels with arpeggio bass2noise - convert bass tones to SN periodic noise </w:t>
+        <w:t xml:space="preserve"> - merge two (normally tone) channels with arpeggio </w:t>
+      </w:r>
+      <w:r>
+        <w:br/>
+      </w:r>
+      <w:r>
+        <w:t xml:space="preserve">arp3tones - merge three (normally tone) channels with arpeggio bass2noise - convert bass tones to SN periodic noise </w:t>
+      </w:r>
+      <w:r>
+        <w:br/>
       </w:r>
       <w:proofErr w:type="spellStart"/>
       <w:r>
@@ -1079,6 +1169,9 @@
       <w:r>
         <w:t xml:space="preserve"> - change playback speed from the default 60hz </w:t>
       </w:r>
+      <w:r>
+        <w:br/>
+      </w:r>
       <w:proofErr w:type="spellStart"/>
       <w:r>
         <w:t>cleardupes</w:t>
@@ -1087,6 +1180,9 @@
       <w:r>
         <w:t xml:space="preserve"> - mute duplicate notes on a channel </w:t>
       </w:r>
+      <w:r>
+        <w:br/>
+      </w:r>
       <w:proofErr w:type="spellStart"/>
       <w:r>
         <w:t>clipmaxvol</w:t>
@@ -1095,6 +1191,9 @@
       <w:r>
         <w:t xml:space="preserve"> - clamps the maximum volume on a channel </w:t>
       </w:r>
+      <w:r>
+        <w:br/>
+      </w:r>
       <w:proofErr w:type="spellStart"/>
       <w:r>
         <w:t>cliptones</w:t>
@@ -1103,15 +1202,34 @@
       <w:r>
         <w:t xml:space="preserve"> - clips out of range notes into range on a channel </w:t>
       </w:r>
-      <w:proofErr w:type="spellStart"/>
-      <w:r>
-        <w:lastRenderedPageBreak/>
+      <w:r>
+        <w:br/>
+      </w:r>
+      <w:proofErr w:type="spellStart"/>
+      <w:r>
         <w:t>despeckle</w:t>
       </w:r>
       <w:proofErr w:type="spellEnd"/>
       <w:r>
         <w:t xml:space="preserve"> - remove single-row sounds from a channel </w:t>
       </w:r>
+      <w:r>
+        <w:t>or fills in single-row mutes</w:t>
+      </w:r>
+      <w:r>
+        <w:br/>
+      </w:r>
+      <w:proofErr w:type="spellStart"/>
+      <w:r>
+        <w:t>fadevolume</w:t>
+      </w:r>
+      <w:proofErr w:type="spellEnd"/>
+      <w:r>
+        <w:t xml:space="preserve"> – fades out a channel over time</w:t>
+      </w:r>
+      <w:r>
+        <w:br/>
+      </w:r>
       <w:proofErr w:type="spellStart"/>
       <w:r>
         <w:t>findmuted</w:t>
@@ -1120,6 +1238,9 @@
       <w:r>
         <w:t xml:space="preserve"> - check all channels of a song for empty channels </w:t>
       </w:r>
+      <w:r>
+        <w:br/>
+      </w:r>
       <w:proofErr w:type="spellStart"/>
       <w:r>
         <w:t>fixsnnoise</w:t>
@@ -1144,6 +1265,9 @@
       <w:r>
         <w:t xml:space="preserve"> - maximize volume over an entire song </w:t>
       </w:r>
+      <w:r>
+        <w:br/>
+      </w:r>
       <w:proofErr w:type="spellStart"/>
       <w:r>
         <w:t>mergenoise</w:t>
@@ -1152,6 +1276,9 @@
       <w:r>
         <w:t xml:space="preserve"> - merge two (normally noise) channels by volume </w:t>
       </w:r>
+      <w:r>
+        <w:br/>
+      </w:r>
       <w:proofErr w:type="spellStart"/>
       <w:r>
         <w:t>mutetones</w:t>
@@ -1160,6 +1287,13 @@
       <w:r>
         <w:t xml:space="preserve"> - mutes out of range notes on a channel </w:t>
       </w:r>
+      <w:r>
+        <w:br/>
+        <w:t>noise2bass – undoes an SN channel periodic noise and creates a tone channel for it</w:t>
+      </w:r>
+      <w:r>
+        <w:br/>
+      </w:r>
       <w:proofErr w:type="spellStart"/>
       <w:r>
         <w:t>padsilence</w:t>
@@ -1176,6 +1310,9 @@
       <w:r>
         <w:t xml:space="preserve"> - reduce the number of frequencies in a song to fit the 256 note limit </w:t>
       </w:r>
+      <w:r>
+        <w:br/>
+      </w:r>
       <w:proofErr w:type="spellStart"/>
       <w:r>
         <w:t>reducevolumecnt</w:t>
@@ -1184,6 +1321,9 @@
       <w:r>
         <w:t xml:space="preserve"> - reduce the number of distinct volume levels to try and improve compression </w:t>
       </w:r>
+      <w:r>
+        <w:br/>
+      </w:r>
       <w:proofErr w:type="spellStart"/>
       <w:r>
         <w:t>retunenoise</w:t>
@@ -1200,6 +1340,9 @@
       <w:r>
         <w:t xml:space="preserve"> - change the pitch of a channel </w:t>
       </w:r>
+      <w:r>
+        <w:br/>
+      </w:r>
       <w:proofErr w:type="spellStart"/>
       <w:r>
         <w:t>scalevolume</w:t>
@@ -1208,13 +1351,23 @@
       <w:r>
         <w:t xml:space="preserve"> - change the volume of a channel </w:t>
       </w:r>
+      <w:r>
+        <w:br/>
+      </w:r>
       <w:proofErr w:type="spellStart"/>
       <w:r>
         <w:t>smoothvolume</w:t>
       </w:r>
       <w:proofErr w:type="spellEnd"/>
       <w:r>
-        <w:t xml:space="preserve"> - smooth out noisy volume (such as mod2psg can do) </w:t>
+        <w:t xml:space="preserve"> - smooth out noisy volume (such as mod2psg can do)</w:t>
+      </w:r>
+      <w:r>
+        <w:br/>
+        <w:t>tremolo – applies a tremolo to a volume channel</w:t>
+      </w:r>
+      <w:r>
+        <w:br/>
       </w:r>
       <w:proofErr w:type="spellStart"/>
       <w:r>
@@ -1237,14 +1390,24 @@
       <w:pPr>
         <w:spacing w:after="7"/>
         <w:ind w:left="9" w:right="355"/>
-      </w:pPr>
-      <w:r>
         <w:rPr>
           <w:b/>
           <w:i/>
         </w:rPr>
+      </w:pPr>
+      <w:r>
+        <w:rPr>
+          <w:b/>
+          <w:i/>
+        </w:rPr>
         <w:t xml:space="preserve">Processing tools </w:t>
       </w:r>
+    </w:p>
+    <w:p>
+      <w:pPr>
+        <w:spacing w:after="7"/>
+        <w:ind w:left="9" w:right="355"/>
+      </w:pPr>
       <w:r>
         <w:t xml:space="preserve">prepare4sn - reads 4 PSG channel files and enforces limits appropriate to the SN PSG, outputting a combined file.  </w:t>
       </w:r>
@@ -1273,6 +1436,7 @@
         <w:ind w:left="9" w:right="13"/>
       </w:pPr>
       <w:r>
+        <w:lastRenderedPageBreak/>
         <w:t xml:space="preserve">QuickPlayer - Windows tool to convert an SBF into a playable file for TI or </w:t>
       </w:r>
       <w:proofErr w:type="spellStart"/>
@@ -1444,7 +1608,6 @@
         <w:rPr>
           <w:rFonts w:ascii="Courier New" w:eastAsia="Courier New" w:hAnsi="Courier New" w:cs="Courier New"/>
         </w:rPr>
-        <w:lastRenderedPageBreak/>
         <w:t xml:space="preserve">Signature not detected.. trying </w:t>
       </w:r>
       <w:proofErr w:type="spellStart"/>
@@ -1654,6 +1817,7 @@
         <w:ind w:left="9" w:right="13"/>
       </w:pPr>
       <w:r>
+        <w:lastRenderedPageBreak/>
         <w:t>There are two ways to select files. If passed a prefix, it will locate all of the _</w:t>
       </w:r>
       <w:proofErr w:type="spellStart"/>
@@ -1702,182 +1866,179 @@
         <w:ind w:left="9" w:right="13"/>
       </w:pPr>
       <w:r>
-        <w:t xml:space="preserve">Timing is an estimate, and the actual playback speed may not be reflected depending on your system’s timing accuracy. Just basic sleeps are used which may not work well on some </w:t>
-      </w:r>
+        <w:t xml:space="preserve">Timing is an estimate, and the actual playback speed may not be reflected depending on your system’s timing accuracy. Just basic sleeps are used which may not work well on some systems. The FPS is displayed while playing so you can determine if it’s playing slow - if it doesn’t hit the target rate (60fps right now), then expect it to sound slower than hardware.  </w:t>
+      </w:r>
+    </w:p>
+    <w:p>
+      <w:pPr>
+        <w:spacing w:after="5"/>
+        <w:ind w:left="9" w:right="13"/>
+      </w:pPr>
+      <w:r>
+        <w:t xml:space="preserve">In addition, due to using DirectSound, this tool is probably the only one that is Windows centric.  </w:t>
+      </w:r>
+    </w:p>
+    <w:p>
+      <w:pPr>
+        <w:ind w:left="9" w:right="13"/>
+      </w:pPr>
+      <w:r>
+        <w:t xml:space="preserve">Mind, it is probably straight forward to port, with just a few calls for the streaming buffer.  </w:t>
+      </w:r>
+    </w:p>
+    <w:p>
+      <w:pPr>
+        <w:ind w:left="9" w:right="13"/>
+      </w:pPr>
+      <w:r>
+        <w:t xml:space="preserve">Supported options:  </w:t>
+      </w:r>
+    </w:p>
+    <w:p>
+      <w:pPr>
+        <w:spacing w:after="7"/>
+        <w:ind w:left="9" w:right="13"/>
+      </w:pPr>
+      <w:r>
+        <w:rPr>
+          <w:b/>
+        </w:rPr>
+        <w:t xml:space="preserve">-ay </w:t>
+      </w:r>
+      <w:r>
+        <w:t xml:space="preserve">- force AY8910 restrictions on playback. Out of range notes are not allowed and noise must share a tone channel’s volume or import will fail.  </w:t>
+      </w:r>
+    </w:p>
+    <w:p>
+      <w:pPr>
+        <w:spacing w:after="7"/>
+        <w:ind w:left="9" w:right="13"/>
+      </w:pPr>
+      <w:r>
+        <w:rPr>
+          <w:b/>
+        </w:rPr>
+        <w:t>-</w:t>
+      </w:r>
+      <w:proofErr w:type="spellStart"/>
+      <w:r>
+        <w:rPr>
+          <w:b/>
+        </w:rPr>
+        <w:t>sn</w:t>
+      </w:r>
+      <w:proofErr w:type="spellEnd"/>
+      <w:r>
+        <w:rPr>
+          <w:b/>
+        </w:rPr>
+        <w:t xml:space="preserve"> </w:t>
+      </w:r>
+      <w:r>
+        <w:t xml:space="preserve">- force SN PSG restrictions on playback. Out of range notes are not allowed and the noise channel must match a fixed rate or the rate of tone channel 3, or import will fail.  </w:t>
+      </w:r>
+    </w:p>
+    <w:p>
+      <w:pPr>
+        <w:spacing w:after="5"/>
+        <w:ind w:left="9" w:right="13"/>
+      </w:pPr>
+      <w:r>
+        <w:rPr>
+          <w:b/>
+        </w:rPr>
+        <w:t>-</w:t>
+      </w:r>
+      <w:proofErr w:type="spellStart"/>
+      <w:r>
+        <w:rPr>
+          <w:b/>
+        </w:rPr>
+        <w:t>hz</w:t>
+      </w:r>
+      <w:proofErr w:type="spellEnd"/>
+      <w:r>
+        <w:rPr>
+          <w:b/>
+        </w:rPr>
+        <w:t xml:space="preserve"> x </w:t>
+      </w:r>
+      <w:r>
+        <w:t xml:space="preserve">- set playback to specified rate, instead of 60hz. Files with an extension like “.60hz” will overrule this option, but it is helpful for PSG or SBF files.  </w:t>
+      </w:r>
+    </w:p>
+    <w:p>
+      <w:pPr>
+        <w:spacing w:after="24"/>
+        <w:ind w:left="9" w:right="13"/>
+      </w:pPr>
+      <w:r>
+        <w:rPr>
+          <w:b/>
+        </w:rPr>
+        <w:t>-</w:t>
+      </w:r>
+      <w:proofErr w:type="spellStart"/>
+      <w:r>
+        <w:rPr>
+          <w:b/>
+        </w:rPr>
+        <w:t>sbfsong</w:t>
+      </w:r>
+      <w:proofErr w:type="spellEnd"/>
+      <w:r>
+        <w:rPr>
+          <w:b/>
+        </w:rPr>
+        <w:t xml:space="preserve"> x </w:t>
+      </w:r>
+      <w:r>
+        <w:t xml:space="preserve">- play song ‘x’ from the SBF file instead of song 0  </w:t>
+      </w:r>
+    </w:p>
+    <w:p>
+      <w:pPr>
+        <w:ind w:left="9" w:right="13"/>
+      </w:pPr>
+      <w:r>
+        <w:rPr>
+          <w:b/>
+        </w:rPr>
+        <w:t>-</w:t>
+      </w:r>
+      <w:proofErr w:type="spellStart"/>
+      <w:r>
+        <w:rPr>
+          <w:b/>
+        </w:rPr>
+        <w:t>hidenotes</w:t>
+      </w:r>
+      <w:proofErr w:type="spellEnd"/>
+      <w:r>
+        <w:rPr>
+          <w:b/>
+        </w:rPr>
+        <w:t xml:space="preserve"> </w:t>
+      </w:r>
+      <w:r>
+        <w:t xml:space="preserve">- do not display the note and volume on each channel as it is playing. This sometimes interferes with playback and makes it a little slower, if you have trouble, don’t do it. ;) </w:t>
+      </w:r>
+      <w:r>
+        <w:rPr>
+          <w:b/>
+        </w:rPr>
+        <w:t xml:space="preserve">-heatmap </w:t>
+      </w:r>
+      <w:r>
+        <w:t xml:space="preserve">- graphically displays a heatmap of the relative file offset each note is read from while playing. This is only useful for the SBF import, though other types may try to show something, it’s just going to advance. Each time a byte in the compressed file is read, it is indicated relatively on the screen with an ‘O’ character, which will fade out over about a quarter second.  </w:t>
+      </w:r>
+    </w:p>
+    <w:p>
+      <w:pPr>
+        <w:ind w:left="9" w:right="13"/>
+      </w:pPr>
       <w:r>
         <w:lastRenderedPageBreak/>
-        <w:t xml:space="preserve">systems. The FPS is displayed while playing so you can determine if it’s playing slow - if it doesn’t hit the target rate (60fps right now), then expect it to sound slower than hardware.  </w:t>
-      </w:r>
-    </w:p>
-    <w:p>
-      <w:pPr>
-        <w:spacing w:after="5"/>
-        <w:ind w:left="9" w:right="13"/>
-      </w:pPr>
-      <w:r>
-        <w:t xml:space="preserve">In addition, due to using DirectSound, this tool is probably the only one that is Windows centric.  </w:t>
-      </w:r>
-    </w:p>
-    <w:p>
-      <w:pPr>
-        <w:ind w:left="9" w:right="13"/>
-      </w:pPr>
-      <w:r>
-        <w:t xml:space="preserve">Mind, it is probably straight forward to port, with just a few calls for the streaming buffer.  </w:t>
-      </w:r>
-    </w:p>
-    <w:p>
-      <w:pPr>
-        <w:ind w:left="9" w:right="13"/>
-      </w:pPr>
-      <w:r>
-        <w:t xml:space="preserve">Supported options:  </w:t>
-      </w:r>
-    </w:p>
-    <w:p>
-      <w:pPr>
-        <w:spacing w:after="7"/>
-        <w:ind w:left="9" w:right="13"/>
-      </w:pPr>
-      <w:r>
-        <w:rPr>
-          <w:b/>
-        </w:rPr>
-        <w:t xml:space="preserve">-ay </w:t>
-      </w:r>
-      <w:r>
-        <w:t xml:space="preserve">- force AY8910 restrictions on playback. Out of range notes are not allowed and noise must share a tone channel’s volume or import will fail.  </w:t>
-      </w:r>
-    </w:p>
-    <w:p>
-      <w:pPr>
-        <w:spacing w:after="7"/>
-        <w:ind w:left="9" w:right="13"/>
-      </w:pPr>
-      <w:r>
-        <w:rPr>
-          <w:b/>
-        </w:rPr>
-        <w:t>-</w:t>
-      </w:r>
-      <w:proofErr w:type="spellStart"/>
-      <w:r>
-        <w:rPr>
-          <w:b/>
-        </w:rPr>
-        <w:t>sn</w:t>
-      </w:r>
-      <w:proofErr w:type="spellEnd"/>
-      <w:r>
-        <w:rPr>
-          <w:b/>
-        </w:rPr>
-        <w:t xml:space="preserve"> </w:t>
-      </w:r>
-      <w:r>
-        <w:t xml:space="preserve">- force SN PSG restrictions on playback. Out of range notes are not allowed and the noise channel must match a fixed rate or the rate of tone channel 3, or import will fail.  </w:t>
-      </w:r>
-    </w:p>
-    <w:p>
-      <w:pPr>
-        <w:spacing w:after="5"/>
-        <w:ind w:left="9" w:right="13"/>
-      </w:pPr>
-      <w:r>
-        <w:rPr>
-          <w:b/>
-        </w:rPr>
-        <w:t>-</w:t>
-      </w:r>
-      <w:proofErr w:type="spellStart"/>
-      <w:r>
-        <w:rPr>
-          <w:b/>
-        </w:rPr>
-        <w:t>hz</w:t>
-      </w:r>
-      <w:proofErr w:type="spellEnd"/>
-      <w:r>
-        <w:rPr>
-          <w:b/>
-        </w:rPr>
-        <w:t xml:space="preserve"> x </w:t>
-      </w:r>
-      <w:r>
-        <w:t xml:space="preserve">- set playback to specified rate, instead of 60hz. Files with an extension like “.60hz” will overrule this option, but it is helpful for PSG or SBF files.  </w:t>
-      </w:r>
-    </w:p>
-    <w:p>
-      <w:pPr>
-        <w:spacing w:after="24"/>
-        <w:ind w:left="9" w:right="13"/>
-      </w:pPr>
-      <w:r>
-        <w:rPr>
-          <w:b/>
-        </w:rPr>
-        <w:t>-</w:t>
-      </w:r>
-      <w:proofErr w:type="spellStart"/>
-      <w:r>
-        <w:rPr>
-          <w:b/>
-        </w:rPr>
-        <w:t>sbfsong</w:t>
-      </w:r>
-      <w:proofErr w:type="spellEnd"/>
-      <w:r>
-        <w:rPr>
-          <w:b/>
-        </w:rPr>
-        <w:t xml:space="preserve"> x </w:t>
-      </w:r>
-      <w:r>
-        <w:t xml:space="preserve">- play song ‘x’ from the SBF file instead of song 0  </w:t>
-      </w:r>
-    </w:p>
-    <w:p>
-      <w:pPr>
-        <w:ind w:left="9" w:right="13"/>
-      </w:pPr>
-      <w:r>
-        <w:rPr>
-          <w:b/>
-        </w:rPr>
-        <w:t>-</w:t>
-      </w:r>
-      <w:proofErr w:type="spellStart"/>
-      <w:r>
-        <w:rPr>
-          <w:b/>
-        </w:rPr>
-        <w:t>hidenotes</w:t>
-      </w:r>
-      <w:proofErr w:type="spellEnd"/>
-      <w:r>
-        <w:rPr>
-          <w:b/>
-        </w:rPr>
-        <w:t xml:space="preserve"> </w:t>
-      </w:r>
-      <w:r>
-        <w:t xml:space="preserve">- do not display the note and volume on each channel as it is playing. This sometimes interferes with playback and makes it a little slower, if you have trouble, don’t do it. ;) </w:t>
-      </w:r>
-      <w:r>
-        <w:rPr>
-          <w:b/>
-        </w:rPr>
-        <w:t xml:space="preserve">-heatmap </w:t>
-      </w:r>
-      <w:r>
-        <w:t xml:space="preserve">- graphically displays a heatmap of the relative file offset each note is read from while playing. This is only useful for the SBF import, though other types may try to show something, it’s just going to advance. Each time a byte in the compressed file is read, it is indicated relatively on the screen with an ‘O’ character, which will fade out over about a quarter second.  </w:t>
-      </w:r>
-    </w:p>
-    <w:p>
-      <w:pPr>
-        <w:ind w:left="9" w:right="13"/>
-      </w:pPr>
-      <w:r>
         <w:t xml:space="preserve">Note that all files must be the same number of lines - variations will cause problems at the end of the song.  </w:t>
       </w:r>
     </w:p>
@@ -2081,7 +2242,6 @@
         <w:ind w:left="9" w:right="13"/>
       </w:pPr>
       <w:r>
-        <w:lastRenderedPageBreak/>
         <w:t xml:space="preserve">No attempt is made to compress or optimize the VGM, you will get every row. As a result, this file is guaranteed to be rather large.  </w:t>
       </w:r>
     </w:p>
@@ -2420,6 +2580,7 @@
         <w:ind w:right="13" w:hanging="720"/>
       </w:pPr>
       <w:r>
+        <w:lastRenderedPageBreak/>
         <w:t xml:space="preserve">Number of frames to delay until the next one The list is terminated with a delay of  </w:t>
       </w:r>
     </w:p>
@@ -2746,7 +2907,6 @@
         <w:rPr>
           <w:rFonts w:ascii="Courier New" w:eastAsia="Courier New" w:hAnsi="Courier New" w:cs="Courier New"/>
         </w:rPr>
-        <w:lastRenderedPageBreak/>
         <w:t>0 tones moved (non-lossy)</w:t>
       </w:r>
       <w:r>
@@ -2973,6 +3133,7 @@
       </w:pPr>
       <w:proofErr w:type="spellStart"/>
       <w:r>
+        <w:lastRenderedPageBreak/>
         <w:t>AnalyzeStream</w:t>
       </w:r>
       <w:proofErr w:type="spellEnd"/>
@@ -3151,7 +3312,6 @@
         <w:rPr>
           <w:rFonts w:ascii="Courier New" w:eastAsia="Courier New" w:hAnsi="Courier New" w:cs="Courier New"/>
         </w:rPr>
-        <w:lastRenderedPageBreak/>
         <w:t>BACKREF- 10 bytes: 62 63 62 61 64 65 66 65 64 61</w:t>
       </w:r>
       <w:r>
@@ -3443,6 +3603,7 @@
         <w:rPr>
           <w:b/>
         </w:rPr>
+        <w:lastRenderedPageBreak/>
         <w:t xml:space="preserve">-q - quieter verbose data </w:t>
       </w:r>
       <w:r>
@@ -3579,7 +3740,6 @@
         <w:rPr>
           <w:b/>
         </w:rPr>
-        <w:lastRenderedPageBreak/>
         <w:t>-</w:t>
       </w:r>
       <w:proofErr w:type="spellStart"/>
@@ -3841,6 +4001,7 @@
         <w:ind w:left="9" w:right="13"/>
       </w:pPr>
       <w:r>
+        <w:lastRenderedPageBreak/>
         <w:t xml:space="preserve">mod2psg uses the </w:t>
       </w:r>
       <w:proofErr w:type="spellStart"/>
@@ -3929,9 +4090,7 @@
         <w:tblInd w:w="10" w:type="dxa"/>
         <w:tblCellMar>
           <w:top w:w="24" w:type="dxa"/>
-          <w:left w:w="0" w:type="dxa"/>
           <w:bottom w:w="1" w:type="dxa"/>
-          <w:right w:w="0" w:type="dxa"/>
         </w:tblCellMar>
         <w:tblLook w:val="04A0" w:firstRow="1" w:lastRow="0" w:firstColumn="1" w:lastColumn="0" w:noHBand="0" w:noVBand="1"/>
       </w:tblPr>
@@ -4062,7 +4221,6 @@
               <w:rPr>
                 <w:rFonts w:ascii="Courier New" w:eastAsia="Courier New" w:hAnsi="Courier New" w:cs="Courier New"/>
               </w:rPr>
-              <w:lastRenderedPageBreak/>
               <w:t>Sample 1: st-01:touch</w:t>
             </w:r>
             <w:r>
@@ -5005,6 +5163,7 @@
         <w:rPr>
           <w:rFonts w:ascii="Courier New" w:eastAsia="Courier New" w:hAnsi="Courier New" w:cs="Courier New"/>
         </w:rPr>
+        <w:lastRenderedPageBreak/>
         <w:t>Wrote 6765 rows...</w:t>
       </w:r>
       <w:r>
@@ -5070,7 +5229,6 @@
         <w:ind w:left="9" w:right="13"/>
       </w:pPr>
       <w:r>
-        <w:lastRenderedPageBreak/>
         <w:t xml:space="preserve">Note there is also a limited psg2playlist for going back the other way, but this is minimally supported since playlists are not the goal of this toolset.  </w:t>
       </w:r>
     </w:p>
@@ -5457,6 +5615,7 @@
         <w:ind w:left="9" w:right="13"/>
       </w:pPr>
       <w:r>
+        <w:lastRenderedPageBreak/>
         <w:t xml:space="preserve">Converts an SBF compressed file (or two files, if they use the SN/SID for TI or SN/AY for </w:t>
       </w:r>
       <w:proofErr w:type="spellStart"/>
@@ -13226,61 +13385,25 @@
         <w:rPr>
           <w:b/>
         </w:rPr>
-        <w:t>fade</w:t>
-      </w:r>
-      <w:r>
-        <w:rPr>
-          <w:b/>
-        </w:rPr>
-        <w:t>volume</w:t>
-      </w:r>
-      <w:proofErr w:type="spellEnd"/>
-      <w:r>
-        <w:rPr>
-          <w:b/>
-        </w:rPr>
-        <w:t xml:space="preserve"> [-q] [-</w:t>
-      </w:r>
-      <w:r>
-        <w:rPr>
-          <w:b/>
-        </w:rPr>
-        <w:t>lines</w:t>
-      </w:r>
-      <w:r>
-        <w:rPr>
-          <w:b/>
-        </w:rPr>
-        <w:t xml:space="preserve"> &lt;n&gt;] &lt;</w:t>
-      </w:r>
-      <w:r>
-        <w:rPr>
-          <w:b/>
-        </w:rPr>
-        <w:t>channel</w:t>
-      </w:r>
-      <w:r>
-        <w:rPr>
-          <w:b/>
-        </w:rPr>
-        <w:t>&gt;</w:t>
-      </w:r>
-      <w:r>
-        <w:t xml:space="preserve">  </w:t>
-      </w:r>
-    </w:p>
-    <w:p>
-      <w:pPr>
-        <w:ind w:left="9" w:right="13"/>
-      </w:pPr>
-      <w:r>
-        <w:t xml:space="preserve">Reads </w:t>
-      </w:r>
-      <w:r>
-        <w:t>one channel fades out the volume over the last ‘lines’ lines. (Default is 30).</w:t>
-      </w:r>
-      <w:r>
-        <w:t xml:space="preserve">  </w:t>
+        <w:t>fadevolume</w:t>
+      </w:r>
+      <w:proofErr w:type="spellEnd"/>
+      <w:r>
+        <w:rPr>
+          <w:b/>
+        </w:rPr>
+        <w:t xml:space="preserve"> [-q] [-lines &lt;n&gt;] &lt;channel&gt;</w:t>
+      </w:r>
+      <w:r>
+        <w:t xml:space="preserve">  </w:t>
+      </w:r>
+    </w:p>
+    <w:p>
+      <w:pPr>
+        <w:ind w:left="9" w:right="13"/>
+      </w:pPr>
+      <w:r>
+        <w:t xml:space="preserve">Reads one channel fades out the volume over the last ‘lines’ lines. (Default is 30).  </w:t>
       </w:r>
     </w:p>
     <w:p>
@@ -13306,28 +13429,10 @@
         <w:rPr>
           <w:b/>
         </w:rPr>
-        <w:t>-</w:t>
-      </w:r>
-      <w:r>
-        <w:rPr>
-          <w:b/>
-        </w:rPr>
-        <w:t>lines</w:t>
-      </w:r>
-      <w:r>
-        <w:rPr>
-          <w:b/>
-        </w:rPr>
-        <w:t xml:space="preserve"> &lt;n&gt; </w:t>
-      </w:r>
-      <w:r>
-        <w:t xml:space="preserve">- </w:t>
-      </w:r>
-      <w:r>
-        <w:t>sets the number of lines to fade the volume out over. For a 60hz song, 30 lines (the default) is about half a second. Existing volumes are scaled out linearly.</w:t>
-      </w:r>
-      <w:r>
-        <w:t xml:space="preserve">  </w:t>
+        <w:t xml:space="preserve">-lines &lt;n&gt; </w:t>
+      </w:r>
+      <w:r>
+        <w:t xml:space="preserve">- sets the number of lines to fade the volume out over. For a 60hz song, 30 lines (the default) is about half a second. Existing volumes are scaled out linearly.  </w:t>
       </w:r>
     </w:p>
     <w:p>
@@ -13339,10 +13444,7 @@
       </w:r>
       <w:proofErr w:type="spellStart"/>
       <w:r>
-        <w:t>fade</w:t>
-      </w:r>
-      <w:r>
-        <w:t>volume.old</w:t>
+        <w:t>fadevolume.old</w:t>
       </w:r>
       <w:proofErr w:type="spellEnd"/>
       <w:r>
@@ -13470,9 +13572,114 @@
         <w:ind w:left="9" w:right="13"/>
       </w:pPr>
       <w:r>
+        <w:t xml:space="preserve">----------------------------------  </w:t>
+      </w:r>
+      <w:r>
         <w:br/>
       </w:r>
       <w:r>
+        <w:br/>
+      </w:r>
+      <w:proofErr w:type="spellStart"/>
+      <w:r>
+        <w:rPr>
+          <w:b/>
+          <w:bCs/>
+        </w:rPr>
+        <w:t>fadevolume</w:t>
+      </w:r>
+      <w:proofErr w:type="spellEnd"/>
+      <w:r>
+        <w:rPr>
+          <w:b/>
+          <w:bCs/>
+        </w:rPr>
+        <w:t xml:space="preserve"> [-</w:t>
+      </w:r>
+      <w:r>
+        <w:rPr>
+          <w:b/>
+          <w:bCs/>
+        </w:rPr>
+        <w:t>v</w:t>
+      </w:r>
+      <w:r>
+        <w:rPr>
+          <w:b/>
+          <w:bCs/>
+        </w:rPr>
+        <w:t>] [-lines &lt;n&gt;] &lt;channel&gt;</w:t>
+      </w:r>
+    </w:p>
+    <w:p>
+      <w:pPr>
+        <w:ind w:left="9" w:right="13"/>
+      </w:pPr>
+      <w:r>
+        <w:t>Fades out an entire song over ‘n’ lines at the end.</w:t>
+      </w:r>
+    </w:p>
+    <w:p>
+      <w:pPr>
+        <w:ind w:left="9" w:right="13"/>
+      </w:pPr>
+      <w:r>
+        <w:t>-v - verbose output</w:t>
+      </w:r>
+      <w:r>
+        <w:br/>
+      </w:r>
+      <w:r>
+        <w:t>-lines &lt;n&gt; - sets the number of lines to fade out over (default 30)</w:t>
+      </w:r>
+    </w:p>
+    <w:p>
+      <w:pPr>
+        <w:ind w:left="9" w:right="13"/>
+      </w:pPr>
+      <w:r>
+        <w:t>song - pass in the name of one channel.</w:t>
+      </w:r>
+    </w:p>
+    <w:p>
+      <w:pPr>
+        <w:ind w:left="9" w:right="13"/>
+      </w:pPr>
+      <w:r>
+        <w:t xml:space="preserve">Original files are renamed </w:t>
+      </w:r>
+      <w:r>
+        <w:t>with</w:t>
+      </w:r>
+      <w:r>
+        <w:t xml:space="preserve"> </w:t>
+      </w:r>
+      <w:r>
+        <w:rPr>
+          <w:i/>
+          <w:iCs/>
+        </w:rPr>
+        <w:t>.</w:t>
+      </w:r>
+      <w:proofErr w:type="spellStart"/>
+      <w:r>
+        <w:rPr>
+          <w:i/>
+          <w:iCs/>
+        </w:rPr>
+        <w:t>fadevolume.old</w:t>
+      </w:r>
+      <w:proofErr w:type="spellEnd"/>
+      <w:r>
+        <w:t xml:space="preserve"> extension.</w:t>
+      </w:r>
+    </w:p>
+    <w:p>
+      <w:pPr>
+        <w:ind w:left="9" w:right="13"/>
+      </w:pPr>
+      <w:r>
+        <w:lastRenderedPageBreak/>
         <w:t xml:space="preserve">----------------------------------  </w:t>
       </w:r>
     </w:p>
@@ -13561,7 +13768,6 @@
         <w:ind w:left="9" w:right="706"/>
       </w:pPr>
       <w:r>
-        <w:lastRenderedPageBreak/>
         <w:t xml:space="preserve">D:\work\TI\vgmcomp2\test\y&gt;..\..\release\findmuted.exe "43 - </w:t>
       </w:r>
       <w:proofErr w:type="spellStart"/>
@@ -13806,6 +14012,7 @@
         <w:ind w:left="9" w:right="13"/>
       </w:pPr>
       <w:r>
+        <w:lastRenderedPageBreak/>
         <w:t>Parses a noise channel (MUST contain “_</w:t>
       </w:r>
       <w:proofErr w:type="spellStart"/>
@@ -13946,7 +14153,6 @@
         <w:rPr>
           <w:rFonts w:ascii="Courier New" w:eastAsia="Courier New" w:hAnsi="Courier New" w:cs="Courier New"/>
         </w:rPr>
-        <w:lastRenderedPageBreak/>
         <w:t xml:space="preserve">Writing: 43 - </w:t>
       </w:r>
       <w:proofErr w:type="spellStart"/>
@@ -14217,6 +14423,7 @@
         <w:rPr>
           <w:b/>
         </w:rPr>
+        <w:lastRenderedPageBreak/>
         <w:t>maximizevolume</w:t>
       </w:r>
       <w:proofErr w:type="spellEnd"/>
@@ -14316,7 +14523,6 @@
         <w:rPr>
           <w:rFonts w:ascii="Courier New" w:eastAsia="Courier New" w:hAnsi="Courier New" w:cs="Courier New"/>
         </w:rPr>
-        <w:lastRenderedPageBreak/>
         <w:t>Song Volume Maximize Tool - v20210707</w:t>
       </w:r>
       <w:r>
@@ -14578,6 +14784,7 @@
         <w:rPr>
           <w:rFonts w:ascii="Courier New" w:eastAsia="Courier New" w:hAnsi="Courier New" w:cs="Courier New"/>
         </w:rPr>
+        <w:lastRenderedPageBreak/>
         <w:t>Opened channel 0: DIGILOO.MOD_noi04.60hz</w:t>
       </w:r>
       <w:r>
@@ -14681,7 +14888,6 @@
         <w:rPr>
           <w:b/>
         </w:rPr>
-        <w:lastRenderedPageBreak/>
         <w:t>mutetones</w:t>
       </w:r>
       <w:proofErr w:type="spellEnd"/>
@@ -14877,6 +15083,103 @@
     </w:p>
     <w:p>
       <w:pPr>
+        <w:ind w:left="9" w:right="13"/>
+        <w:rPr>
+          <w:b/>
+          <w:bCs/>
+        </w:rPr>
+      </w:pPr>
+      <w:r>
+        <w:rPr>
+          <w:b/>
+          <w:bCs/>
+        </w:rPr>
+        <w:t>noise2bass [-q] [-mute] &lt;song&gt;</w:t>
+      </w:r>
+    </w:p>
+    <w:p>
+      <w:pPr>
+        <w:ind w:left="9" w:right="13"/>
+      </w:pPr>
+      <w:r>
+        <w:t>Converts periodic noise back to tone channels.</w:t>
+      </w:r>
+      <w:r>
+        <w:t xml:space="preserve"> </w:t>
+      </w:r>
+      <w:r>
+        <w:t>A /new/ tone channel is written to support this for each noise channel</w:t>
+      </w:r>
+      <w:r>
+        <w:t xml:space="preserve"> (u</w:t>
+      </w:r>
+      <w:r>
+        <w:t>nless there is no periodic noise found on that noise channel</w:t>
+      </w:r>
+      <w:r>
+        <w:t>)</w:t>
+      </w:r>
+      <w:r>
+        <w:t>.</w:t>
+      </w:r>
+    </w:p>
+    <w:p>
+      <w:pPr>
+        <w:ind w:left="9" w:right="13"/>
+      </w:pPr>
+      <w:r>
+        <w:t>This is intended for converting SN tunes to other chips.</w:t>
+      </w:r>
+    </w:p>
+    <w:p>
+      <w:pPr>
+        <w:ind w:left="9" w:right="13"/>
+      </w:pPr>
+      <w:r>
+        <w:lastRenderedPageBreak/>
+        <w:t>-q - quiet verbose output</w:t>
+      </w:r>
+      <w:r>
+        <w:br/>
+      </w:r>
+      <w:r>
+        <w:t>song - pass in the entire name of ONE channel, the entire song will be found and updated.</w:t>
+      </w:r>
+    </w:p>
+    <w:p>
+      <w:pPr>
+        <w:ind w:left="9" w:right="13"/>
+      </w:pPr>
+      <w:r>
+        <w:t xml:space="preserve">Original files are renamed </w:t>
+      </w:r>
+      <w:r>
+        <w:t>with</w:t>
+      </w:r>
+      <w:r>
+        <w:t xml:space="preserve"> </w:t>
+      </w:r>
+      <w:r>
+        <w:rPr>
+          <w:i/>
+          <w:iCs/>
+        </w:rPr>
+        <w:t>.noise2bass.old</w:t>
+      </w:r>
+      <w:r>
+        <w:t xml:space="preserve"> extension.</w:t>
+      </w:r>
+    </w:p>
+    <w:p>
+      <w:pPr>
+        <w:ind w:left="9" w:right="13"/>
+      </w:pPr>
+      <w:r>
+        <w:t xml:space="preserve">----------------------------------  </w:t>
+      </w:r>
+    </w:p>
+    <w:p>
+      <w:pPr>
         <w:spacing w:after="46" w:line="588" w:lineRule="auto"/>
         <w:ind w:left="9" w:right="3022"/>
       </w:pPr>
@@ -15038,14 +15341,7 @@
         <w:rPr>
           <w:rFonts w:ascii="Courier New" w:eastAsia="Courier New" w:hAnsi="Courier New" w:cs="Courier New"/>
         </w:rPr>
-        <w:t xml:space="preserve">Opened </w:t>
-      </w:r>
-      <w:r>
-        <w:rPr>
-          <w:rFonts w:ascii="Courier New" w:eastAsia="Courier New" w:hAnsi="Courier New" w:cs="Courier New"/>
-        </w:rPr>
-        <w:lastRenderedPageBreak/>
-        <w:t>channel 3: guile_gb.vgz_noi03.60hz Imported 4182 rows...</w:t>
+        <w:t>Opened channel 3: guile_gb.vgz_noi03.60hz Imported 4182 rows...</w:t>
       </w:r>
       <w:r>
         <w:t xml:space="preserve">  </w:t>
@@ -15220,6 +15516,7 @@
         <w:ind w:left="9" w:right="13"/>
       </w:pPr>
       <w:r>
+        <w:lastRenderedPageBreak/>
         <w:t xml:space="preserve">Reduces the number of unique tones in a song using a popularity based algorithm, weighted to prefer notes appearing to be musical.  </w:t>
       </w:r>
     </w:p>
@@ -15407,456 +15704,456 @@
         <w:rPr>
           <w:rFonts w:ascii="Courier New" w:eastAsia="Courier New" w:hAnsi="Courier New" w:cs="Courier New"/>
         </w:rPr>
+        <w:t>VGMComp2 Tone Count reduction Tool - v20200923</w:t>
+      </w:r>
+      <w:r>
+        <w:t xml:space="preserve">  </w:t>
+      </w:r>
+    </w:p>
+    <w:p>
+      <w:pPr>
+        <w:spacing w:after="104" w:line="270" w:lineRule="auto"/>
+        <w:ind w:left="19" w:hanging="10"/>
+      </w:pPr>
+      <w:r>
+        <w:rPr>
+          <w:rFonts w:ascii="Courier New" w:eastAsia="Courier New" w:hAnsi="Courier New" w:cs="Courier New"/>
+        </w:rPr>
+        <w:t>Using musical note tolerance of 1</w:t>
+      </w:r>
+      <w:r>
+        <w:t xml:space="preserve">  </w:t>
+      </w:r>
+    </w:p>
+    <w:p>
+      <w:pPr>
+        <w:spacing w:after="104" w:line="270" w:lineRule="auto"/>
+        <w:ind w:left="19" w:hanging="10"/>
+      </w:pPr>
+      <w:r>
+        <w:rPr>
+          <w:rFonts w:ascii="Courier New" w:eastAsia="Courier New" w:hAnsi="Courier New" w:cs="Courier New"/>
+        </w:rPr>
+        <w:t>Opened channel 0: AWSOME4.MOD_ton00.60hz</w:t>
+      </w:r>
+      <w:r>
+        <w:t xml:space="preserve">  </w:t>
+      </w:r>
+    </w:p>
+    <w:p>
+      <w:pPr>
+        <w:spacing w:after="104" w:line="270" w:lineRule="auto"/>
+        <w:ind w:left="19" w:hanging="10"/>
+      </w:pPr>
+      <w:r>
+        <w:rPr>
+          <w:rFonts w:ascii="Courier New" w:eastAsia="Courier New" w:hAnsi="Courier New" w:cs="Courier New"/>
+        </w:rPr>
+        <w:t>Opened channel 1: AWSOME4.MOD_ton01.60hz</w:t>
+      </w:r>
+      <w:r>
+        <w:t xml:space="preserve">  </w:t>
+      </w:r>
+    </w:p>
+    <w:p>
+      <w:pPr>
+        <w:spacing w:after="104" w:line="270" w:lineRule="auto"/>
+        <w:ind w:left="19" w:hanging="10"/>
+      </w:pPr>
+      <w:r>
+        <w:rPr>
+          <w:rFonts w:ascii="Courier New" w:eastAsia="Courier New" w:hAnsi="Courier New" w:cs="Courier New"/>
+        </w:rPr>
+        <w:t>Opened channel 2: AWSOME4.MOD_ton02.60hz</w:t>
+      </w:r>
+      <w:r>
+        <w:t xml:space="preserve">  </w:t>
+      </w:r>
+    </w:p>
+    <w:p>
+      <w:pPr>
+        <w:spacing w:after="104" w:line="270" w:lineRule="auto"/>
+        <w:ind w:left="19" w:hanging="10"/>
+      </w:pPr>
+      <w:r>
+        <w:rPr>
+          <w:rFonts w:ascii="Courier New" w:eastAsia="Courier New" w:hAnsi="Courier New" w:cs="Courier New"/>
+        </w:rPr>
+        <w:t>Opened channel 3: AWSOME4.MOD_ton03.60hz</w:t>
+      </w:r>
+      <w:r>
+        <w:t xml:space="preserve">  </w:t>
+      </w:r>
+    </w:p>
+    <w:p>
+      <w:pPr>
+        <w:spacing w:after="104" w:line="270" w:lineRule="auto"/>
+        <w:ind w:left="19" w:hanging="10"/>
+      </w:pPr>
+      <w:r>
+        <w:rPr>
+          <w:rFonts w:ascii="Courier New" w:eastAsia="Courier New" w:hAnsi="Courier New" w:cs="Courier New"/>
+        </w:rPr>
+        <w:t>Opened channel 4: AWSOME4.MOD_noi04.60hz</w:t>
+      </w:r>
+      <w:r>
+        <w:t xml:space="preserve">  </w:t>
+      </w:r>
+    </w:p>
+    <w:p>
+      <w:pPr>
+        <w:spacing w:after="104" w:line="270" w:lineRule="auto"/>
+        <w:ind w:left="19" w:hanging="10"/>
+      </w:pPr>
+      <w:r>
+        <w:rPr>
+          <w:rFonts w:ascii="Courier New" w:eastAsia="Courier New" w:hAnsi="Courier New" w:cs="Courier New"/>
+        </w:rPr>
+        <w:t>Opened channel 5: AWSOME4.MOD_noi05.60hz</w:t>
+      </w:r>
+      <w:r>
+        <w:t xml:space="preserve">  </w:t>
+      </w:r>
+    </w:p>
+    <w:p>
+      <w:pPr>
+        <w:spacing w:after="104" w:line="270" w:lineRule="auto"/>
+        <w:ind w:left="19" w:hanging="10"/>
+      </w:pPr>
+      <w:r>
+        <w:rPr>
+          <w:rFonts w:ascii="Courier New" w:eastAsia="Courier New" w:hAnsi="Courier New" w:cs="Courier New"/>
+        </w:rPr>
+        <w:t>Opened channel 6: AWSOME4.MOD_noi06.60hz</w:t>
+      </w:r>
+      <w:r>
+        <w:t xml:space="preserve">  </w:t>
+      </w:r>
+    </w:p>
+    <w:p>
+      <w:pPr>
+        <w:spacing w:after="104" w:line="270" w:lineRule="auto"/>
+        <w:ind w:left="19" w:hanging="10"/>
+      </w:pPr>
+      <w:r>
+        <w:rPr>
+          <w:rFonts w:ascii="Courier New" w:eastAsia="Courier New" w:hAnsi="Courier New" w:cs="Courier New"/>
+        </w:rPr>
+        <w:t>Opened channel 7: AWSOME4.MOD_noi07.60hz</w:t>
+      </w:r>
+      <w:r>
+        <w:t xml:space="preserve">  </w:t>
+      </w:r>
+    </w:p>
+    <w:p>
+      <w:pPr>
+        <w:spacing w:after="104" w:line="270" w:lineRule="auto"/>
+        <w:ind w:left="19" w:hanging="10"/>
+      </w:pPr>
+      <w:r>
+        <w:rPr>
+          <w:rFonts w:ascii="Courier New" w:eastAsia="Courier New" w:hAnsi="Courier New" w:cs="Courier New"/>
+        </w:rPr>
+        <w:t>Counting number of frequencies...228 frequencies used (want 200).</w:t>
+      </w:r>
+      <w:r>
+        <w:t xml:space="preserve"> </w:t>
+      </w:r>
+      <w:r>
+        <w:rPr>
+          <w:rFonts w:ascii="Courier New" w:eastAsia="Courier New" w:hAnsi="Courier New" w:cs="Courier New"/>
+        </w:rPr>
+        <w:t>Popularity adjusted 5 ticks at step 2</w:t>
+      </w:r>
+      <w:r>
+        <w:t xml:space="preserve">  </w:t>
+      </w:r>
+    </w:p>
+    <w:p>
+      <w:pPr>
+        <w:spacing w:after="104" w:line="270" w:lineRule="auto"/>
+        <w:ind w:left="19" w:hanging="10"/>
+      </w:pPr>
+      <w:r>
+        <w:rPr>
+          <w:rFonts w:ascii="Courier New" w:eastAsia="Courier New" w:hAnsi="Courier New" w:cs="Courier New"/>
+        </w:rPr>
+        <w:t>Counting number of frequencies...227 frequencies used (want 200).</w:t>
+      </w:r>
+      <w:r>
+        <w:t xml:space="preserve">  </w:t>
+      </w:r>
+    </w:p>
+    <w:p>
+      <w:pPr>
+        <w:spacing w:after="104" w:line="270" w:lineRule="auto"/>
+        <w:ind w:left="19" w:hanging="10"/>
+      </w:pPr>
+      <w:r>
+        <w:rPr>
+          <w:rFonts w:ascii="Courier New" w:eastAsia="Courier New" w:hAnsi="Courier New" w:cs="Courier New"/>
+        </w:rPr>
         <w:lastRenderedPageBreak/>
-        <w:t>VGMComp2 Tone Count reduction Tool - v20200923</w:t>
-      </w:r>
-      <w:r>
-        <w:t xml:space="preserve">  </w:t>
-      </w:r>
-    </w:p>
-    <w:p>
-      <w:pPr>
-        <w:spacing w:after="104" w:line="270" w:lineRule="auto"/>
-        <w:ind w:left="19" w:hanging="10"/>
-      </w:pPr>
-      <w:r>
-        <w:rPr>
-          <w:rFonts w:ascii="Courier New" w:eastAsia="Courier New" w:hAnsi="Courier New" w:cs="Courier New"/>
-        </w:rPr>
-        <w:t>Using musical note tolerance of 1</w:t>
-      </w:r>
-      <w:r>
-        <w:t xml:space="preserve">  </w:t>
-      </w:r>
-    </w:p>
-    <w:p>
-      <w:pPr>
-        <w:spacing w:after="104" w:line="270" w:lineRule="auto"/>
-        <w:ind w:left="19" w:hanging="10"/>
-      </w:pPr>
-      <w:r>
-        <w:rPr>
-          <w:rFonts w:ascii="Courier New" w:eastAsia="Courier New" w:hAnsi="Courier New" w:cs="Courier New"/>
-        </w:rPr>
-        <w:t>Opened channel 0: AWSOME4.MOD_ton00.60hz</w:t>
-      </w:r>
-      <w:r>
-        <w:t xml:space="preserve">  </w:t>
-      </w:r>
-    </w:p>
-    <w:p>
-      <w:pPr>
-        <w:spacing w:after="104" w:line="270" w:lineRule="auto"/>
-        <w:ind w:left="19" w:hanging="10"/>
-      </w:pPr>
-      <w:r>
-        <w:rPr>
-          <w:rFonts w:ascii="Courier New" w:eastAsia="Courier New" w:hAnsi="Courier New" w:cs="Courier New"/>
-        </w:rPr>
-        <w:t>Opened channel 1: AWSOME4.MOD_ton01.60hz</w:t>
-      </w:r>
-      <w:r>
-        <w:t xml:space="preserve">  </w:t>
-      </w:r>
-    </w:p>
-    <w:p>
-      <w:pPr>
-        <w:spacing w:after="104" w:line="270" w:lineRule="auto"/>
-        <w:ind w:left="19" w:hanging="10"/>
-      </w:pPr>
-      <w:r>
-        <w:rPr>
-          <w:rFonts w:ascii="Courier New" w:eastAsia="Courier New" w:hAnsi="Courier New" w:cs="Courier New"/>
-        </w:rPr>
-        <w:t>Opened channel 2: AWSOME4.MOD_ton02.60hz</w:t>
-      </w:r>
-      <w:r>
-        <w:t xml:space="preserve">  </w:t>
-      </w:r>
-    </w:p>
-    <w:p>
-      <w:pPr>
-        <w:spacing w:after="104" w:line="270" w:lineRule="auto"/>
-        <w:ind w:left="19" w:hanging="10"/>
-      </w:pPr>
-      <w:r>
-        <w:rPr>
-          <w:rFonts w:ascii="Courier New" w:eastAsia="Courier New" w:hAnsi="Courier New" w:cs="Courier New"/>
-        </w:rPr>
-        <w:t>Opened channel 3: AWSOME4.MOD_ton03.60hz</w:t>
-      </w:r>
-      <w:r>
-        <w:t xml:space="preserve">  </w:t>
-      </w:r>
-    </w:p>
-    <w:p>
-      <w:pPr>
-        <w:spacing w:after="104" w:line="270" w:lineRule="auto"/>
-        <w:ind w:left="19" w:hanging="10"/>
-      </w:pPr>
-      <w:r>
-        <w:rPr>
-          <w:rFonts w:ascii="Courier New" w:eastAsia="Courier New" w:hAnsi="Courier New" w:cs="Courier New"/>
-        </w:rPr>
-        <w:t>Opened channel 4: AWSOME4.MOD_noi04.60hz</w:t>
-      </w:r>
-      <w:r>
-        <w:t xml:space="preserve">  </w:t>
-      </w:r>
-    </w:p>
-    <w:p>
-      <w:pPr>
-        <w:spacing w:after="104" w:line="270" w:lineRule="auto"/>
-        <w:ind w:left="19" w:hanging="10"/>
-      </w:pPr>
-      <w:r>
-        <w:rPr>
-          <w:rFonts w:ascii="Courier New" w:eastAsia="Courier New" w:hAnsi="Courier New" w:cs="Courier New"/>
-        </w:rPr>
-        <w:t>Opened channel 5: AWSOME4.MOD_noi05.60hz</w:t>
-      </w:r>
-      <w:r>
-        <w:t xml:space="preserve">  </w:t>
-      </w:r>
-    </w:p>
-    <w:p>
-      <w:pPr>
-        <w:spacing w:after="104" w:line="270" w:lineRule="auto"/>
-        <w:ind w:left="19" w:hanging="10"/>
-      </w:pPr>
-      <w:r>
-        <w:rPr>
-          <w:rFonts w:ascii="Courier New" w:eastAsia="Courier New" w:hAnsi="Courier New" w:cs="Courier New"/>
-        </w:rPr>
-        <w:t>Opened channel 6: AWSOME4.MOD_noi06.60hz</w:t>
-      </w:r>
-      <w:r>
-        <w:t xml:space="preserve">  </w:t>
-      </w:r>
-    </w:p>
-    <w:p>
-      <w:pPr>
-        <w:spacing w:after="104" w:line="270" w:lineRule="auto"/>
-        <w:ind w:left="19" w:hanging="10"/>
-      </w:pPr>
-      <w:r>
-        <w:rPr>
-          <w:rFonts w:ascii="Courier New" w:eastAsia="Courier New" w:hAnsi="Courier New" w:cs="Courier New"/>
-        </w:rPr>
-        <w:t>Opened channel 7: AWSOME4.MOD_noi07.60hz</w:t>
-      </w:r>
-      <w:r>
-        <w:t xml:space="preserve">  </w:t>
-      </w:r>
-    </w:p>
-    <w:p>
-      <w:pPr>
-        <w:spacing w:after="104" w:line="270" w:lineRule="auto"/>
-        <w:ind w:left="19" w:hanging="10"/>
-      </w:pPr>
-      <w:r>
-        <w:rPr>
-          <w:rFonts w:ascii="Courier New" w:eastAsia="Courier New" w:hAnsi="Courier New" w:cs="Courier New"/>
-        </w:rPr>
-        <w:t>Counting number of frequencies...228 frequencies used (want 200).</w:t>
+        <w:t>-Popularity adjusted 31 ticks at step 3</w:t>
+      </w:r>
+      <w:r>
+        <w:t xml:space="preserve">  </w:t>
+      </w:r>
+    </w:p>
+    <w:p>
+      <w:pPr>
+        <w:spacing w:after="104" w:line="270" w:lineRule="auto"/>
+        <w:ind w:left="19" w:hanging="10"/>
+      </w:pPr>
+      <w:r>
+        <w:rPr>
+          <w:rFonts w:ascii="Courier New" w:eastAsia="Courier New" w:hAnsi="Courier New" w:cs="Courier New"/>
+        </w:rPr>
+        <w:t>Counting number of frequencies...222 frequencies used (want 200).</w:t>
+      </w:r>
+      <w:r>
+        <w:t xml:space="preserve">  </w:t>
+      </w:r>
+    </w:p>
+    <w:p>
+      <w:pPr>
+        <w:spacing w:after="104" w:line="270" w:lineRule="auto"/>
+        <w:ind w:left="19" w:hanging="10"/>
+      </w:pPr>
+      <w:r>
+        <w:rPr>
+          <w:rFonts w:ascii="Courier New" w:eastAsia="Courier New" w:hAnsi="Courier New" w:cs="Courier New"/>
+        </w:rPr>
+        <w:t>-Popularity adjusted 46 ticks at step 4</w:t>
+      </w:r>
+      <w:r>
+        <w:t xml:space="preserve">  </w:t>
+      </w:r>
+    </w:p>
+    <w:p>
+      <w:pPr>
+        <w:spacing w:after="104" w:line="270" w:lineRule="auto"/>
+        <w:ind w:left="19" w:hanging="10"/>
+      </w:pPr>
+      <w:r>
+        <w:rPr>
+          <w:rFonts w:ascii="Courier New" w:eastAsia="Courier New" w:hAnsi="Courier New" w:cs="Courier New"/>
+        </w:rPr>
+        <w:t>Counting number of frequencies...213 frequencies used (want 200).</w:t>
+      </w:r>
+      <w:r>
+        <w:t xml:space="preserve">  </w:t>
+      </w:r>
+    </w:p>
+    <w:p>
+      <w:pPr>
+        <w:spacing w:after="104" w:line="270" w:lineRule="auto"/>
+        <w:ind w:left="19" w:hanging="10"/>
+      </w:pPr>
+      <w:r>
+        <w:rPr>
+          <w:rFonts w:ascii="Courier New" w:eastAsia="Courier New" w:hAnsi="Courier New" w:cs="Courier New"/>
+        </w:rPr>
+        <w:t>-Popularity adjusted 55 ticks at step 5</w:t>
+      </w:r>
+      <w:r>
+        <w:t xml:space="preserve">  </w:t>
+      </w:r>
+    </w:p>
+    <w:p>
+      <w:pPr>
+        <w:spacing w:after="104" w:line="270" w:lineRule="auto"/>
+        <w:ind w:left="19" w:hanging="10"/>
+      </w:pPr>
+      <w:r>
+        <w:rPr>
+          <w:rFonts w:ascii="Courier New" w:eastAsia="Courier New" w:hAnsi="Courier New" w:cs="Courier New"/>
+        </w:rPr>
+        <w:t>Counting number of frequencies...209 frequencies used (want 200).</w:t>
+      </w:r>
+      <w:r>
+        <w:t xml:space="preserve">  </w:t>
+      </w:r>
+    </w:p>
+    <w:p>
+      <w:pPr>
+        <w:spacing w:after="104" w:line="270" w:lineRule="auto"/>
+        <w:ind w:left="19" w:hanging="10"/>
+      </w:pPr>
+      <w:r>
+        <w:rPr>
+          <w:rFonts w:ascii="Courier New" w:eastAsia="Courier New" w:hAnsi="Courier New" w:cs="Courier New"/>
+        </w:rPr>
+        <w:t>-Popularity adjusted 86 ticks at step 6</w:t>
+      </w:r>
+      <w:r>
+        <w:t xml:space="preserve">  </w:t>
+      </w:r>
+    </w:p>
+    <w:p>
+      <w:pPr>
+        <w:spacing w:after="104" w:line="270" w:lineRule="auto"/>
+        <w:ind w:left="19" w:hanging="10"/>
+      </w:pPr>
+      <w:r>
+        <w:rPr>
+          <w:rFonts w:ascii="Courier New" w:eastAsia="Courier New" w:hAnsi="Courier New" w:cs="Courier New"/>
+        </w:rPr>
+        <w:t>Counting number of frequencies...198 frequencies used (want 200).</w:t>
+      </w:r>
+      <w:r>
+        <w:t xml:space="preserve">  </w:t>
+      </w:r>
+    </w:p>
+    <w:p>
+      <w:pPr>
+        <w:spacing w:after="104" w:line="270" w:lineRule="auto"/>
+        <w:ind w:left="19" w:hanging="10"/>
+      </w:pPr>
+      <w:r>
+        <w:rPr>
+          <w:rFonts w:ascii="Courier New" w:eastAsia="Courier New" w:hAnsi="Courier New" w:cs="Courier New"/>
+        </w:rPr>
+        <w:t>223/54120 notes adjusted</w:t>
+      </w:r>
+      <w:r>
+        <w:t xml:space="preserve">  </w:t>
+      </w:r>
+    </w:p>
+    <w:p>
+      <w:pPr>
+        <w:spacing w:after="104" w:line="270" w:lineRule="auto"/>
+        <w:ind w:left="19" w:hanging="10"/>
+      </w:pPr>
+      <w:r>
+        <w:rPr>
+          <w:rFonts w:ascii="Courier New" w:eastAsia="Courier New" w:hAnsi="Courier New" w:cs="Courier New"/>
+        </w:rPr>
+        <w:t>198 frequencies in final.</w:t>
+      </w:r>
+      <w:r>
+        <w:t xml:space="preserve">  </w:t>
+      </w:r>
+    </w:p>
+    <w:p>
+      <w:pPr>
+        <w:spacing w:after="104" w:line="270" w:lineRule="auto"/>
+        <w:ind w:left="19" w:hanging="10"/>
+      </w:pPr>
+      <w:r>
+        <w:rPr>
+          <w:rFonts w:ascii="Courier New" w:eastAsia="Courier New" w:hAnsi="Courier New" w:cs="Courier New"/>
+        </w:rPr>
+        <w:t>Writing: AWSOME4.MOD_ton00.60hz</w:t>
+      </w:r>
+      <w:r>
+        <w:t xml:space="preserve">  </w:t>
+      </w:r>
+    </w:p>
+    <w:p>
+      <w:pPr>
+        <w:spacing w:after="104" w:line="270" w:lineRule="auto"/>
+        <w:ind w:left="19" w:hanging="10"/>
+      </w:pPr>
+      <w:r>
+        <w:rPr>
+          <w:rFonts w:ascii="Courier New" w:eastAsia="Courier New" w:hAnsi="Courier New" w:cs="Courier New"/>
+        </w:rPr>
+        <w:t>Writing: AWSOME4.MOD_ton01.60hz</w:t>
+      </w:r>
+      <w:r>
+        <w:t xml:space="preserve">  </w:t>
+      </w:r>
+    </w:p>
+    <w:p>
+      <w:pPr>
+        <w:spacing w:after="104" w:line="270" w:lineRule="auto"/>
+        <w:ind w:left="19" w:hanging="10"/>
+      </w:pPr>
+      <w:r>
+        <w:rPr>
+          <w:rFonts w:ascii="Courier New" w:eastAsia="Courier New" w:hAnsi="Courier New" w:cs="Courier New"/>
+        </w:rPr>
+        <w:t>Writing: AWSOME4.MOD_ton02.60hz</w:t>
+      </w:r>
+      <w:r>
+        <w:t xml:space="preserve">  </w:t>
+      </w:r>
+    </w:p>
+    <w:p>
+      <w:pPr>
+        <w:spacing w:after="104" w:line="270" w:lineRule="auto"/>
+        <w:ind w:left="19" w:hanging="10"/>
+      </w:pPr>
+      <w:r>
+        <w:rPr>
+          <w:rFonts w:ascii="Courier New" w:eastAsia="Courier New" w:hAnsi="Courier New" w:cs="Courier New"/>
+        </w:rPr>
+        <w:t>Writing: AWSOME4.MOD_ton03.60hz</w:t>
+      </w:r>
+      <w:r>
+        <w:t xml:space="preserve">  </w:t>
+      </w:r>
+    </w:p>
+    <w:p>
+      <w:pPr>
+        <w:spacing w:after="104" w:line="270" w:lineRule="auto"/>
+        <w:ind w:left="19" w:hanging="10"/>
+      </w:pPr>
+      <w:r>
+        <w:rPr>
+          <w:rFonts w:ascii="Courier New" w:eastAsia="Courier New" w:hAnsi="Courier New" w:cs="Courier New"/>
+        </w:rPr>
+        <w:t>Writing: AWSOME4.MOD_noi04.60hz</w:t>
+      </w:r>
+      <w:r>
+        <w:t xml:space="preserve">  </w:t>
+      </w:r>
+    </w:p>
+    <w:p>
+      <w:pPr>
+        <w:spacing w:after="104" w:line="270" w:lineRule="auto"/>
+        <w:ind w:left="19" w:hanging="10"/>
+      </w:pPr>
+      <w:r>
+        <w:rPr>
+          <w:rFonts w:ascii="Courier New" w:eastAsia="Courier New" w:hAnsi="Courier New" w:cs="Courier New"/>
+        </w:rPr>
+        <w:t>Writing: AWSOME4.MOD_noi05.60hz</w:t>
+      </w:r>
+      <w:r>
+        <w:t xml:space="preserve">  </w:t>
+      </w:r>
+    </w:p>
+    <w:p>
+      <w:pPr>
+        <w:spacing w:after="104" w:line="270" w:lineRule="auto"/>
+        <w:ind w:left="19" w:hanging="10"/>
+      </w:pPr>
+      <w:r>
+        <w:rPr>
+          <w:rFonts w:ascii="Courier New" w:eastAsia="Courier New" w:hAnsi="Courier New" w:cs="Courier New"/>
+        </w:rPr>
+        <w:t>Writing: AWSOME4.MOD_noi06.60hz</w:t>
+      </w:r>
+      <w:r>
+        <w:t xml:space="preserve">  </w:t>
+      </w:r>
+    </w:p>
+    <w:p>
+      <w:pPr>
+        <w:spacing w:after="104" w:line="270" w:lineRule="auto"/>
+        <w:ind w:left="19" w:hanging="10"/>
+      </w:pPr>
+      <w:r>
+        <w:rPr>
+          <w:rFonts w:ascii="Courier New" w:eastAsia="Courier New" w:hAnsi="Courier New" w:cs="Courier New"/>
+        </w:rPr>
+        <w:t xml:space="preserve">Writing: AWSOME4.MOD_noi07.60hz </w:t>
       </w:r>
       <w:r>
         <w:t xml:space="preserve"> </w:t>
       </w:r>
-      <w:r>
-        <w:rPr>
-          <w:rFonts w:ascii="Courier New" w:eastAsia="Courier New" w:hAnsi="Courier New" w:cs="Courier New"/>
-        </w:rPr>
-        <w:t>Popularity adjusted 5 ticks at step 2</w:t>
-      </w:r>
-      <w:r>
-        <w:t xml:space="preserve">  </w:t>
-      </w:r>
-    </w:p>
-    <w:p>
-      <w:pPr>
-        <w:spacing w:after="104" w:line="270" w:lineRule="auto"/>
-        <w:ind w:left="19" w:hanging="10"/>
-      </w:pPr>
-      <w:r>
-        <w:rPr>
-          <w:rFonts w:ascii="Courier New" w:eastAsia="Courier New" w:hAnsi="Courier New" w:cs="Courier New"/>
-        </w:rPr>
-        <w:t>Counting number of frequencies...227 frequencies used (want 200).</w:t>
-      </w:r>
-      <w:r>
-        <w:t xml:space="preserve">  </w:t>
-      </w:r>
-    </w:p>
-    <w:p>
-      <w:pPr>
-        <w:spacing w:after="104" w:line="270" w:lineRule="auto"/>
-        <w:ind w:left="19" w:hanging="10"/>
-      </w:pPr>
-      <w:r>
-        <w:rPr>
-          <w:rFonts w:ascii="Courier New" w:eastAsia="Courier New" w:hAnsi="Courier New" w:cs="Courier New"/>
-        </w:rPr>
-        <w:t>-Popularity adjusted 31 ticks at step 3</w:t>
-      </w:r>
-      <w:r>
-        <w:t xml:space="preserve">  </w:t>
-      </w:r>
-    </w:p>
-    <w:p>
-      <w:pPr>
-        <w:spacing w:after="104" w:line="270" w:lineRule="auto"/>
-        <w:ind w:left="19" w:hanging="10"/>
-      </w:pPr>
-      <w:r>
-        <w:rPr>
-          <w:rFonts w:ascii="Courier New" w:eastAsia="Courier New" w:hAnsi="Courier New" w:cs="Courier New"/>
-        </w:rPr>
-        <w:t>Counting number of frequencies...222 frequencies used (want 200).</w:t>
-      </w:r>
-      <w:r>
-        <w:t xml:space="preserve">  </w:t>
-      </w:r>
-    </w:p>
-    <w:p>
-      <w:pPr>
-        <w:spacing w:after="104" w:line="270" w:lineRule="auto"/>
-        <w:ind w:left="19" w:hanging="10"/>
-      </w:pPr>
-      <w:r>
-        <w:rPr>
-          <w:rFonts w:ascii="Courier New" w:eastAsia="Courier New" w:hAnsi="Courier New" w:cs="Courier New"/>
-        </w:rPr>
-        <w:t>-Popularity adjusted 46 ticks at step 4</w:t>
-      </w:r>
-      <w:r>
-        <w:t xml:space="preserve">  </w:t>
-      </w:r>
-    </w:p>
-    <w:p>
-      <w:pPr>
-        <w:spacing w:after="104" w:line="270" w:lineRule="auto"/>
-        <w:ind w:left="19" w:hanging="10"/>
-      </w:pPr>
-      <w:r>
-        <w:rPr>
-          <w:rFonts w:ascii="Courier New" w:eastAsia="Courier New" w:hAnsi="Courier New" w:cs="Courier New"/>
-        </w:rPr>
-        <w:t>Counting number of frequencies...213 frequencies used (want 200).</w:t>
-      </w:r>
-      <w:r>
-        <w:t xml:space="preserve">  </w:t>
-      </w:r>
-    </w:p>
-    <w:p>
-      <w:pPr>
-        <w:spacing w:after="104" w:line="270" w:lineRule="auto"/>
-        <w:ind w:left="19" w:hanging="10"/>
-      </w:pPr>
-      <w:r>
-        <w:rPr>
-          <w:rFonts w:ascii="Courier New" w:eastAsia="Courier New" w:hAnsi="Courier New" w:cs="Courier New"/>
-        </w:rPr>
-        <w:t>-Popularity adjusted 55 ticks at step 5</w:t>
-      </w:r>
-      <w:r>
-        <w:t xml:space="preserve">  </w:t>
-      </w:r>
-    </w:p>
-    <w:p>
-      <w:pPr>
-        <w:spacing w:after="104" w:line="270" w:lineRule="auto"/>
-        <w:ind w:left="19" w:hanging="10"/>
-      </w:pPr>
-      <w:r>
-        <w:rPr>
-          <w:rFonts w:ascii="Courier New" w:eastAsia="Courier New" w:hAnsi="Courier New" w:cs="Courier New"/>
-        </w:rPr>
-        <w:t>Counting number of frequencies...209 frequencies used (want 200).</w:t>
-      </w:r>
-      <w:r>
-        <w:t xml:space="preserve">  </w:t>
-      </w:r>
-    </w:p>
-    <w:p>
-      <w:pPr>
-        <w:spacing w:after="104" w:line="270" w:lineRule="auto"/>
-        <w:ind w:left="19" w:hanging="10"/>
-      </w:pPr>
-      <w:r>
-        <w:rPr>
-          <w:rFonts w:ascii="Courier New" w:eastAsia="Courier New" w:hAnsi="Courier New" w:cs="Courier New"/>
-        </w:rPr>
-        <w:t>-Popularity adjusted 86 ticks at step 6</w:t>
-      </w:r>
-      <w:r>
-        <w:t xml:space="preserve">  </w:t>
-      </w:r>
-    </w:p>
-    <w:p>
-      <w:pPr>
-        <w:spacing w:after="104" w:line="270" w:lineRule="auto"/>
-        <w:ind w:left="19" w:hanging="10"/>
-      </w:pPr>
-      <w:r>
-        <w:rPr>
-          <w:rFonts w:ascii="Courier New" w:eastAsia="Courier New" w:hAnsi="Courier New" w:cs="Courier New"/>
-        </w:rPr>
-        <w:t>Counting number of frequencies...198 frequencies used (want 200).</w:t>
-      </w:r>
-      <w:r>
-        <w:t xml:space="preserve">  </w:t>
-      </w:r>
-    </w:p>
-    <w:p>
-      <w:pPr>
-        <w:spacing w:after="104" w:line="270" w:lineRule="auto"/>
-        <w:ind w:left="19" w:hanging="10"/>
-      </w:pPr>
-      <w:r>
-        <w:rPr>
-          <w:rFonts w:ascii="Courier New" w:eastAsia="Courier New" w:hAnsi="Courier New" w:cs="Courier New"/>
-        </w:rPr>
-        <w:t>223/54120 notes adjusted</w:t>
-      </w:r>
-      <w:r>
-        <w:t xml:space="preserve">  </w:t>
-      </w:r>
-    </w:p>
-    <w:p>
-      <w:pPr>
-        <w:spacing w:after="104" w:line="270" w:lineRule="auto"/>
-        <w:ind w:left="19" w:hanging="10"/>
-      </w:pPr>
-      <w:r>
-        <w:rPr>
-          <w:rFonts w:ascii="Courier New" w:eastAsia="Courier New" w:hAnsi="Courier New" w:cs="Courier New"/>
-        </w:rPr>
-        <w:t>198 frequencies in final.</w:t>
-      </w:r>
-      <w:r>
-        <w:t xml:space="preserve">  </w:t>
-      </w:r>
-    </w:p>
-    <w:p>
-      <w:pPr>
-        <w:spacing w:after="104" w:line="270" w:lineRule="auto"/>
-        <w:ind w:left="19" w:hanging="10"/>
-      </w:pPr>
-      <w:r>
-        <w:rPr>
-          <w:rFonts w:ascii="Courier New" w:eastAsia="Courier New" w:hAnsi="Courier New" w:cs="Courier New"/>
-        </w:rPr>
-        <w:t>Writing: AWSOME4.MOD_ton00.60hz</w:t>
-      </w:r>
-      <w:r>
-        <w:t xml:space="preserve">  </w:t>
-      </w:r>
-    </w:p>
-    <w:p>
-      <w:pPr>
-        <w:spacing w:after="104" w:line="270" w:lineRule="auto"/>
-        <w:ind w:left="19" w:hanging="10"/>
-      </w:pPr>
-      <w:r>
-        <w:rPr>
-          <w:rFonts w:ascii="Courier New" w:eastAsia="Courier New" w:hAnsi="Courier New" w:cs="Courier New"/>
-        </w:rPr>
-        <w:t>Writing: AWSOME4.MOD_ton01.60hz</w:t>
-      </w:r>
-      <w:r>
-        <w:t xml:space="preserve">  </w:t>
-      </w:r>
-    </w:p>
-    <w:p>
-      <w:pPr>
-        <w:spacing w:after="104" w:line="270" w:lineRule="auto"/>
-        <w:ind w:left="19" w:hanging="10"/>
-      </w:pPr>
-      <w:r>
-        <w:rPr>
-          <w:rFonts w:ascii="Courier New" w:eastAsia="Courier New" w:hAnsi="Courier New" w:cs="Courier New"/>
-        </w:rPr>
-        <w:t>Writing: AWSOME4.MOD_ton02.60hz</w:t>
-      </w:r>
-      <w:r>
-        <w:t xml:space="preserve">  </w:t>
-      </w:r>
-    </w:p>
-    <w:p>
-      <w:pPr>
-        <w:spacing w:after="104" w:line="270" w:lineRule="auto"/>
-        <w:ind w:left="19" w:hanging="10"/>
-      </w:pPr>
-      <w:r>
-        <w:rPr>
-          <w:rFonts w:ascii="Courier New" w:eastAsia="Courier New" w:hAnsi="Courier New" w:cs="Courier New"/>
-        </w:rPr>
-        <w:t>Writing: AWSOME4.MOD_ton03.60hz</w:t>
-      </w:r>
-      <w:r>
-        <w:t xml:space="preserve">  </w:t>
-      </w:r>
-    </w:p>
-    <w:p>
-      <w:pPr>
-        <w:spacing w:after="104" w:line="270" w:lineRule="auto"/>
-        <w:ind w:left="19" w:hanging="10"/>
-      </w:pPr>
-      <w:r>
-        <w:rPr>
-          <w:rFonts w:ascii="Courier New" w:eastAsia="Courier New" w:hAnsi="Courier New" w:cs="Courier New"/>
-        </w:rPr>
-        <w:t>Writing: AWSOME4.MOD_noi04.60hz</w:t>
-      </w:r>
-      <w:r>
-        <w:t xml:space="preserve">  </w:t>
-      </w:r>
-    </w:p>
-    <w:p>
-      <w:pPr>
-        <w:spacing w:after="104" w:line="270" w:lineRule="auto"/>
-        <w:ind w:left="19" w:hanging="10"/>
-      </w:pPr>
-      <w:r>
-        <w:rPr>
-          <w:rFonts w:ascii="Courier New" w:eastAsia="Courier New" w:hAnsi="Courier New" w:cs="Courier New"/>
-        </w:rPr>
-        <w:t>Writing: AWSOME4.MOD_noi05.60hz</w:t>
-      </w:r>
-      <w:r>
-        <w:t xml:space="preserve">  </w:t>
-      </w:r>
-    </w:p>
-    <w:p>
-      <w:pPr>
-        <w:spacing w:after="104" w:line="270" w:lineRule="auto"/>
-        <w:ind w:left="19" w:hanging="10"/>
-      </w:pPr>
-      <w:r>
-        <w:rPr>
-          <w:rFonts w:ascii="Courier New" w:eastAsia="Courier New" w:hAnsi="Courier New" w:cs="Courier New"/>
-        </w:rPr>
-        <w:t>Writing: AWSOME4.MOD_noi06.60hz</w:t>
-      </w:r>
-      <w:r>
-        <w:t xml:space="preserve">  </w:t>
-      </w:r>
-    </w:p>
-    <w:p>
-      <w:pPr>
-        <w:spacing w:after="104" w:line="270" w:lineRule="auto"/>
-        <w:ind w:left="19" w:hanging="10"/>
-      </w:pPr>
-      <w:r>
-        <w:rPr>
-          <w:rFonts w:ascii="Courier New" w:eastAsia="Courier New" w:hAnsi="Courier New" w:cs="Courier New"/>
-        </w:rPr>
-        <w:t xml:space="preserve">Writing: AWSOME4.MOD_noi07.60hz </w:t>
-      </w:r>
-      <w:r>
-        <w:t xml:space="preserve"> </w:t>
-      </w:r>
     </w:p>
     <w:p>
       <w:pPr>
@@ -15878,7 +16175,6 @@
         <w:ind w:left="9" w:right="13"/>
       </w:pPr>
       <w:r>
-        <w:lastRenderedPageBreak/>
         <w:t xml:space="preserve">----------------------------------  </w:t>
       </w:r>
     </w:p>
@@ -15985,6 +16281,7 @@
         <w:rPr>
           <w:rFonts w:ascii="Courier New" w:eastAsia="Courier New" w:hAnsi="Courier New" w:cs="Courier New"/>
         </w:rPr>
+        <w:lastRenderedPageBreak/>
         <w:t>D:\&gt;</w:t>
       </w:r>
       <w:r>
@@ -16222,11 +16519,7 @@
         <w:ind w:left="9" w:right="13"/>
       </w:pPr>
       <w:r>
-        <w:t xml:space="preserve">This can be useful if you have a song that comes from a 16-bit shift register, and also plays custom noise and all three channels at once. If retuning to a default shift frequency doesn't work, you can use this to force the noise to match the passed channel, and hopefully the detune </w:t>
-      </w:r>
-      <w:r>
-        <w:lastRenderedPageBreak/>
-        <w:t xml:space="preserve">is less obvious. You usually want to force periodic in this case to override any white noise drums.  </w:t>
+        <w:t xml:space="preserve">This can be useful if you have a song that comes from a 16-bit shift register, and also plays custom noise and all three channels at once. If retuning to a default shift frequency doesn't work, you can use this to force the noise to match the passed channel, and hopefully the detune is less obvious. You usually want to force periodic in this case to override any white noise drums.  </w:t>
       </w:r>
     </w:p>
     <w:p>
@@ -16414,6 +16707,7 @@
         <w:ind w:left="9" w:right="13"/>
       </w:pPr>
       <w:r>
+        <w:lastRenderedPageBreak/>
         <w:t xml:space="preserve">----------------------------------  </w:t>
       </w:r>
     </w:p>
@@ -16656,7 +16950,6 @@
         <w:rPr>
           <w:rFonts w:ascii="Courier New" w:eastAsia="Courier New" w:hAnsi="Courier New" w:cs="Courier New"/>
         </w:rPr>
-        <w:lastRenderedPageBreak/>
         <w:t xml:space="preserve">G#  8/12    0.6666      1.3333     </w:t>
       </w:r>
       <w:r>
@@ -16913,6 +17206,7 @@
         <w:ind w:left="9" w:right="13"/>
       </w:pPr>
       <w:r>
+        <w:lastRenderedPageBreak/>
         <w:t xml:space="preserve">----------------------------------  </w:t>
       </w:r>
     </w:p>
@@ -17092,7 +17386,6 @@
         <w:rPr>
           <w:rFonts w:ascii="Courier New" w:eastAsia="Courier New" w:hAnsi="Courier New" w:cs="Courier New"/>
         </w:rPr>
-        <w:lastRenderedPageBreak/>
         <w:t>0 volumes zeroed (lossy)</w:t>
       </w:r>
       <w:r>
@@ -17284,6 +17577,7 @@
         <w:rPr>
           <w:rFonts w:ascii="Courier New" w:eastAsia="Courier New" w:hAnsi="Courier New" w:cs="Courier New"/>
         </w:rPr>
+        <w:lastRenderedPageBreak/>
         <w:t>D:\&gt;</w:t>
       </w:r>
       <w:r>
@@ -17451,7 +17745,6 @@
         <w:rPr>
           <w:b/>
         </w:rPr>
-        <w:lastRenderedPageBreak/>
         <w:t xml:space="preserve">Speed: a float that represents the scaling factor. There’s no hard unit here, but 1.0 represents roughly 6-7 rows. </w:t>
       </w:r>
     </w:p>
@@ -17616,6 +17909,100 @@
         <w:ind w:left="9" w:right="13"/>
       </w:pPr>
       <w:r>
+        <w:lastRenderedPageBreak/>
+        <w:t xml:space="preserve">----------------------------------  </w:t>
+      </w:r>
+    </w:p>
+    <w:p>
+      <w:pPr>
+        <w:ind w:left="9" w:right="13"/>
+      </w:pPr>
+      <w:r>
+        <w:rPr>
+          <w:b/>
+          <w:bCs/>
+        </w:rPr>
+        <w:t>tremolo &lt;ramp in time in frames&gt; &lt;sine amplitude in percent (0-1)&gt; &lt;speed (float)&gt; &lt;channel input&gt;</w:t>
+      </w:r>
+      <w:r>
+        <w:rPr>
+          <w:b/>
+          <w:bCs/>
+        </w:rPr>
+        <w:t xml:space="preserve"> - </w:t>
+      </w:r>
+      <w:r>
+        <w:t xml:space="preserve"> applies tremolo to a volume channel</w:t>
+      </w:r>
+    </w:p>
+    <w:p>
+      <w:pPr>
+        <w:ind w:left="9" w:right="13"/>
+      </w:pPr>
+      <w:r>
+        <w:t>Applies a tremolo to the existing volume. The strength of the tremolo</w:t>
+      </w:r>
+      <w:r>
+        <w:t xml:space="preserve"> </w:t>
+      </w:r>
+      <w:r>
+        <w:t>ramps in from 0 to 'sine amplitude' percent over 'ramp in time' frames.</w:t>
+      </w:r>
+      <w:r>
+        <w:t xml:space="preserve"> </w:t>
+      </w:r>
+      <w:r>
+        <w:t>The existing volume is the CENTER volume of the sine wave, so you may need to adjust before using.</w:t>
+      </w:r>
+      <w:r>
+        <w:t xml:space="preserve"> </w:t>
+      </w:r>
+      <w:r>
+        <w:t>The ramp resets every time the frequency or volume changes. Use 0 for no ramp.</w:t>
+      </w:r>
+    </w:p>
+    <w:p>
+      <w:pPr>
+        <w:ind w:left="9" w:right="13"/>
+      </w:pPr>
+      <w:r>
+        <w:t xml:space="preserve">Original file is renamed </w:t>
+      </w:r>
+      <w:r>
+        <w:t xml:space="preserve">with </w:t>
+      </w:r>
+      <w:r>
+        <w:rPr>
+          <w:i/>
+          <w:iCs/>
+        </w:rPr>
+        <w:t>.</w:t>
+      </w:r>
+      <w:proofErr w:type="spellStart"/>
+      <w:r>
+        <w:rPr>
+          <w:i/>
+          <w:iCs/>
+        </w:rPr>
+        <w:t>tremolo.old</w:t>
+      </w:r>
+      <w:proofErr w:type="spellEnd"/>
+      <w:r>
+        <w:rPr>
+          <w:i/>
+          <w:iCs/>
+        </w:rPr>
+        <w:t xml:space="preserve"> </w:t>
+      </w:r>
+      <w:r>
+        <w:t>extension.</w:t>
+      </w:r>
+    </w:p>
+    <w:p>
+      <w:pPr>
+        <w:ind w:left="9" w:right="13"/>
+      </w:pPr>
+      <w:r>
         <w:t xml:space="preserve">----------------------------------  </w:t>
       </w:r>
     </w:p>
@@ -17810,7 +18197,6 @@
         <w:rPr>
           <w:rFonts w:ascii="Courier New" w:eastAsia="Courier New" w:hAnsi="Courier New" w:cs="Courier New"/>
         </w:rPr>
-        <w:lastRenderedPageBreak/>
         <w:t>Silence Trimming Tool - v20201008</w:t>
       </w:r>
       <w:r>
@@ -17874,6 +18260,7 @@
         <w:rPr>
           <w:rFonts w:ascii="Courier New" w:eastAsia="Courier New" w:hAnsi="Courier New" w:cs="Courier New"/>
         </w:rPr>
+        <w:lastRenderedPageBreak/>
         <w:t>1 rows trimmed from start</w:t>
       </w:r>
       <w:r>
@@ -18006,7 +18393,25 @@
         <w:ind w:left="9" w:right="13"/>
       </w:pPr>
       <w:r>
-        <w:t xml:space="preserve">Merges chan2 into chan1. Chan1 always gets priority if both channels are active. Original file is renamed with </w:t>
+        <w:t>Merges chan</w:t>
+      </w:r>
+      <w:r>
+        <w:t>1</w:t>
+      </w:r>
+      <w:r>
+        <w:t xml:space="preserve"> into chan</w:t>
+      </w:r>
+      <w:r>
+        <w:t>2</w:t>
+      </w:r>
+      <w:r>
+        <w:t>. Chan</w:t>
+      </w:r>
+      <w:r>
+        <w:t>2</w:t>
+      </w:r>
+      <w:r>
+        <w:t xml:space="preserve"> always gets priority if both channels are active. Original file is renamed with </w:t>
       </w:r>
       <w:r>
         <w:rPr>
@@ -18081,7 +18486,25 @@
         <w:rPr>
           <w:rFonts w:ascii="Courier New" w:eastAsia="Courier New" w:hAnsi="Courier New" w:cs="Courier New"/>
         </w:rPr>
-        <w:t>VGMComp2 Underlay Tool - v20240414</w:t>
+        <w:t>VGMComp2 Underlay Tool - v202</w:t>
+      </w:r>
+      <w:r>
+        <w:rPr>
+          <w:rFonts w:ascii="Courier New" w:eastAsia="Courier New" w:hAnsi="Courier New" w:cs="Courier New"/>
+        </w:rPr>
+        <w:t>6</w:t>
+      </w:r>
+      <w:r>
+        <w:rPr>
+          <w:rFonts w:ascii="Courier New" w:eastAsia="Courier New" w:hAnsi="Courier New" w:cs="Courier New"/>
+        </w:rPr>
+        <w:t>0</w:t>
+      </w:r>
+      <w:r>
+        <w:rPr>
+          <w:rFonts w:ascii="Courier New" w:eastAsia="Courier New" w:hAnsi="Courier New" w:cs="Courier New"/>
+        </w:rPr>
+        <w:t>723</w:t>
       </w:r>
       <w:r>
         <w:t xml:space="preserve">  </w:t>
@@ -18102,6 +18525,9 @@
         <w:t xml:space="preserve">  </w:t>
       </w:r>
       <w:r>
+        <w:br/>
+      </w:r>
+      <w:r>
         <w:rPr>
           <w:rFonts w:ascii="Courier New" w:eastAsia="Courier New" w:hAnsi="Courier New" w:cs="Courier New"/>
         </w:rPr>
@@ -18165,7 +18591,19 @@
         <w:rPr>
           <w:rFonts w:ascii="Courier New" w:eastAsia="Courier New" w:hAnsi="Courier New" w:cs="Courier New"/>
         </w:rPr>
-        <w:t xml:space="preserve">Writing: TakeaChance.vgz_ton00.60hz </w:t>
+        <w:t>Writing: TakeaChance.vgz_ton0</w:t>
+      </w:r>
+      <w:r>
+        <w:rPr>
+          <w:rFonts w:ascii="Courier New" w:eastAsia="Courier New" w:hAnsi="Courier New" w:cs="Courier New"/>
+        </w:rPr>
+        <w:t>1</w:t>
+      </w:r>
+      <w:r>
+        <w:rPr>
+          <w:rFonts w:ascii="Courier New" w:eastAsia="Courier New" w:hAnsi="Courier New" w:cs="Courier New"/>
+        </w:rPr>
+        <w:t xml:space="preserve">.60hz </w:t>
       </w:r>
       <w:r>
         <w:t xml:space="preserve"> </w:t>
@@ -18203,26 +18641,26 @@
         <w:rPr>
           <w:b/>
         </w:rPr>
+        <w:t>prepare4SN &lt;tone1&gt; &lt;tone2&gt; &lt;tone3&gt; &lt;noise&gt; &lt;output&gt;</w:t>
+      </w:r>
+      <w:r>
+        <w:t xml:space="preserve">  </w:t>
+      </w:r>
+    </w:p>
+    <w:p>
+      <w:pPr>
+        <w:ind w:left="9" w:right="13"/>
+      </w:pPr>
+      <w:r>
+        <w:t xml:space="preserve">Takes in three tone channels and one noise channel, any of which may be “-” to leave muted. This will parse the PSG format inputs and produce a combined output file ready to be compressed for the SN PSG chip.  </w:t>
+      </w:r>
+    </w:p>
+    <w:p>
+      <w:pPr>
+        <w:ind w:left="9" w:right="13"/>
+      </w:pPr>
+      <w:r>
         <w:lastRenderedPageBreak/>
-        <w:t>prepare4SN &lt;tone1&gt; &lt;tone2&gt; &lt;tone3&gt; &lt;noise&gt; &lt;output&gt;</w:t>
-      </w:r>
-      <w:r>
-        <w:t xml:space="preserve">  </w:t>
-      </w:r>
-    </w:p>
-    <w:p>
-      <w:pPr>
-        <w:ind w:left="9" w:right="13"/>
-      </w:pPr>
-      <w:r>
-        <w:t xml:space="preserve">Takes in three tone channels and one noise channel, any of which may be “-” to leave muted. This will parse the PSG format inputs and produce a combined output file ready to be compressed for the SN PSG chip.  </w:t>
-      </w:r>
-    </w:p>
-    <w:p>
-      <w:pPr>
-        <w:ind w:left="9" w:right="13"/>
-      </w:pPr>
-      <w:r>
         <w:t xml:space="preserve">The output is a combined file with 8 comma-separated, hexadecimal values per row, representing the data for the PSG for each frame, alternating channel shift rate, volume. The noise is presented as the PSG noise command, optionally with the trigger bit set (0x10000).  </w:t>
       </w:r>
     </w:p>
@@ -18416,7 +18854,6 @@
         <w:rPr>
           <w:rFonts w:ascii="Courier New" w:eastAsia="Courier New" w:hAnsi="Courier New" w:cs="Courier New"/>
         </w:rPr>
-        <w:lastRenderedPageBreak/>
         <w:t>0 tones moved (non-lossy)</w:t>
       </w:r>
       <w:r>
@@ -18467,6 +18904,7 @@
         <w:ind w:left="9" w:right="13"/>
       </w:pPr>
       <w:r>
+        <w:lastRenderedPageBreak/>
         <w:t xml:space="preserve">----------------------------------  </w:t>
       </w:r>
     </w:p>
@@ -18587,74 +19025,74 @@
           <w:rFonts w:ascii="Courier New" w:eastAsia="Courier New" w:hAnsi="Courier New" w:cs="Courier New"/>
           <w:i/>
         </w:rPr>
+        <w:t xml:space="preserve">D:\&gt;prepare4AY.exe ab_psg.vgz_ton00.60hz ab_psg.vgz_ton01.60hz ab_psg.vgz_ton02.60hz ab_psg.vgz_noi03.60hz </w:t>
+      </w:r>
+      <w:proofErr w:type="spellStart"/>
+      <w:r>
+        <w:rPr>
+          <w:rFonts w:ascii="Courier New" w:eastAsia="Courier New" w:hAnsi="Courier New" w:cs="Courier New"/>
+          <w:i/>
+        </w:rPr>
+        <w:t>ab.psgay</w:t>
+      </w:r>
+      <w:proofErr w:type="spellEnd"/>
+      <w:r>
+        <w:rPr>
+          <w:rFonts w:ascii="Courier New" w:eastAsia="Courier New" w:hAnsi="Courier New" w:cs="Courier New"/>
+          <w:i/>
+        </w:rPr>
+        <w:t xml:space="preserve"> </w:t>
+      </w:r>
+      <w:r>
+        <w:rPr>
+          <w:rFonts w:ascii="Courier New" w:eastAsia="Courier New" w:hAnsi="Courier New" w:cs="Courier New"/>
+        </w:rPr>
+        <w:t>VGMComp2 AY Prep Tool - v20200525</w:t>
+      </w:r>
+      <w:r>
+        <w:t xml:space="preserve">  </w:t>
+      </w:r>
+    </w:p>
+    <w:p>
+      <w:pPr>
+        <w:spacing w:after="104" w:line="270" w:lineRule="auto"/>
+        <w:ind w:left="19" w:hanging="10"/>
+      </w:pPr>
+      <w:r>
+        <w:rPr>
+          <w:rFonts w:ascii="Courier New" w:eastAsia="Courier New" w:hAnsi="Courier New" w:cs="Courier New"/>
+        </w:rPr>
+        <w:t>Opened tone channel 0: ab_psg.vgz_ton00.60hz</w:t>
+      </w:r>
+      <w:r>
+        <w:t xml:space="preserve">  </w:t>
+      </w:r>
+    </w:p>
+    <w:p>
+      <w:pPr>
+        <w:spacing w:after="104" w:line="270" w:lineRule="auto"/>
+        <w:ind w:left="19" w:hanging="10"/>
+      </w:pPr>
+      <w:r>
+        <w:rPr>
+          <w:rFonts w:ascii="Courier New" w:eastAsia="Courier New" w:hAnsi="Courier New" w:cs="Courier New"/>
+        </w:rPr>
+        <w:t>Opened tone channel 1: ab_psg.vgz_ton01.60hz</w:t>
+      </w:r>
+      <w:r>
+        <w:t xml:space="preserve">  </w:t>
+      </w:r>
+    </w:p>
+    <w:p>
+      <w:pPr>
+        <w:spacing w:after="104" w:line="270" w:lineRule="auto"/>
+        <w:ind w:left="19" w:hanging="10"/>
+      </w:pPr>
+      <w:r>
+        <w:rPr>
+          <w:rFonts w:ascii="Courier New" w:eastAsia="Courier New" w:hAnsi="Courier New" w:cs="Courier New"/>
+        </w:rPr>
         <w:lastRenderedPageBreak/>
-        <w:t xml:space="preserve">D:\&gt;prepare4AY.exe ab_psg.vgz_ton00.60hz ab_psg.vgz_ton01.60hz ab_psg.vgz_ton02.60hz ab_psg.vgz_noi03.60hz </w:t>
-      </w:r>
-      <w:proofErr w:type="spellStart"/>
-      <w:r>
-        <w:rPr>
-          <w:rFonts w:ascii="Courier New" w:eastAsia="Courier New" w:hAnsi="Courier New" w:cs="Courier New"/>
-          <w:i/>
-        </w:rPr>
-        <w:t>ab.psgay</w:t>
-      </w:r>
-      <w:proofErr w:type="spellEnd"/>
-      <w:r>
-        <w:rPr>
-          <w:rFonts w:ascii="Courier New" w:eastAsia="Courier New" w:hAnsi="Courier New" w:cs="Courier New"/>
-          <w:i/>
-        </w:rPr>
-        <w:t xml:space="preserve"> </w:t>
-      </w:r>
-      <w:r>
-        <w:rPr>
-          <w:rFonts w:ascii="Courier New" w:eastAsia="Courier New" w:hAnsi="Courier New" w:cs="Courier New"/>
-        </w:rPr>
-        <w:t>VGMComp2 AY Prep Tool - v20200525</w:t>
-      </w:r>
-      <w:r>
-        <w:t xml:space="preserve">  </w:t>
-      </w:r>
-    </w:p>
-    <w:p>
-      <w:pPr>
-        <w:spacing w:after="104" w:line="270" w:lineRule="auto"/>
-        <w:ind w:left="19" w:hanging="10"/>
-      </w:pPr>
-      <w:r>
-        <w:rPr>
-          <w:rFonts w:ascii="Courier New" w:eastAsia="Courier New" w:hAnsi="Courier New" w:cs="Courier New"/>
-        </w:rPr>
-        <w:t>Opened tone channel 0: ab_psg.vgz_ton00.60hz</w:t>
-      </w:r>
-      <w:r>
-        <w:t xml:space="preserve">  </w:t>
-      </w:r>
-    </w:p>
-    <w:p>
-      <w:pPr>
-        <w:spacing w:after="104" w:line="270" w:lineRule="auto"/>
-        <w:ind w:left="19" w:hanging="10"/>
-      </w:pPr>
-      <w:r>
-        <w:rPr>
-          <w:rFonts w:ascii="Courier New" w:eastAsia="Courier New" w:hAnsi="Courier New" w:cs="Courier New"/>
-        </w:rPr>
-        <w:t>Opened tone channel 1: ab_psg.vgz_ton01.60hz</w:t>
-      </w:r>
-      <w:r>
-        <w:t xml:space="preserve">  </w:t>
-      </w:r>
-    </w:p>
-    <w:p>
-      <w:pPr>
-        <w:spacing w:after="104" w:line="270" w:lineRule="auto"/>
-        <w:ind w:left="19" w:hanging="10"/>
-      </w:pPr>
-      <w:r>
-        <w:rPr>
-          <w:rFonts w:ascii="Courier New" w:eastAsia="Courier New" w:hAnsi="Courier New" w:cs="Courier New"/>
-        </w:rPr>
         <w:t>Opened tone channel 2: ab_psg.vgz_ton02.60hz</w:t>
       </w:r>
       <w:r>
@@ -18845,7 +19283,6 @@
         <w:ind w:left="9" w:right="13"/>
       </w:pPr>
       <w:r>
-        <w:lastRenderedPageBreak/>
         <w:t>The only limitation is that tones or noises with a pitch too high to be played (</w:t>
       </w:r>
       <w:proofErr w:type="spellStart"/>
@@ -18868,6 +19305,7 @@
           <w:rFonts w:ascii="Courier New" w:eastAsia="Courier New" w:hAnsi="Courier New" w:cs="Courier New"/>
           <w:i/>
         </w:rPr>
+        <w:lastRenderedPageBreak/>
         <w:t xml:space="preserve">D:&gt;prepare4SID.exe ab_psg.vgz_ton00.60hz ab_psg.vgz_ton01.60hz ab_psg.vgz_ton02.60hz </w:t>
       </w:r>
       <w:proofErr w:type="spellStart"/>
@@ -19397,19 +19835,19 @@
         <w:ind w:left="9" w:right="13"/>
       </w:pPr>
       <w:r>
+        <w:t xml:space="preserve">There are a number of parameters to disable tests in the compressor. In general, the compressor should make good decisions about the best choice (it tries enough of them!), but in rare cases disabling one or more modes may help, particularly the larger RLE modes.  </w:t>
+      </w:r>
+    </w:p>
+    <w:p>
+      <w:pPr>
+        <w:spacing w:after="5"/>
+        <w:ind w:left="9" w:right="13"/>
+      </w:pPr>
+      <w:r>
+        <w:rPr>
+          <w:b/>
+        </w:rPr>
         <w:lastRenderedPageBreak/>
-        <w:t xml:space="preserve">There are a number of parameters to disable tests in the compressor. In general, the compressor should make good decisions about the best choice (it tries enough of them!), but in rare cases disabling one or more modes may help, particularly the larger RLE modes.  </w:t>
-      </w:r>
-    </w:p>
-    <w:p>
-      <w:pPr>
-        <w:spacing w:after="5"/>
-        <w:ind w:left="9" w:right="13"/>
-      </w:pPr>
-      <w:r>
-        <w:rPr>
-          <w:b/>
-        </w:rPr>
         <w:t>-</w:t>
       </w:r>
       <w:proofErr w:type="spellStart"/>
@@ -19974,7 +20412,6 @@
               <w:rPr>
                 <w:b/>
               </w:rPr>
-              <w:lastRenderedPageBreak/>
               <w:t>Tone volume levels</w:t>
             </w:r>
             <w:r>
@@ -20096,6 +20533,7 @@
               <w:rPr>
                 <w:b/>
               </w:rPr>
+              <w:lastRenderedPageBreak/>
               <w:t>Noise range</w:t>
             </w:r>
             <w:r>
@@ -20547,23 +20985,23 @@
         <w:ind w:left="9" w:right="13"/>
       </w:pPr>
       <w:r>
+        <w:t xml:space="preserve">This alternate form of the vgmcomp2 exe will pack any binary file as a single stream in compressed </w:t>
+      </w:r>
+      <w:proofErr w:type="spellStart"/>
+      <w:r>
+        <w:t>sbf</w:t>
+      </w:r>
+      <w:proofErr w:type="spellEnd"/>
+      <w:r>
+        <w:t xml:space="preserve"> form. The existing library can be used to unpack the data.  </w:t>
+      </w:r>
+    </w:p>
+    <w:p>
+      <w:pPr>
+        <w:ind w:left="9" w:right="13"/>
+      </w:pPr>
+      <w:r>
         <w:lastRenderedPageBreak/>
-        <w:t xml:space="preserve">This alternate form of the vgmcomp2 exe will pack any binary file as a single stream in compressed </w:t>
-      </w:r>
-      <w:proofErr w:type="spellStart"/>
-      <w:r>
-        <w:t>sbf</w:t>
-      </w:r>
-      <w:proofErr w:type="spellEnd"/>
-      <w:r>
-        <w:t xml:space="preserve"> form. The existing library can be used to unpack the data.  </w:t>
-      </w:r>
-    </w:p>
-    <w:p>
-      <w:pPr>
-        <w:ind w:left="9" w:right="13"/>
-      </w:pPr>
-      <w:r>
         <w:t xml:space="preserve">All the switches in the above documentation not relating to multiple streams or chip types can be used with this form as well.  </w:t>
       </w:r>
     </w:p>
@@ -20718,9 +21156,6 @@
         <w:tblInd w:w="29" w:type="dxa"/>
         <w:tblCellMar>
           <w:top w:w="28" w:type="dxa"/>
-          <w:left w:w="0" w:type="dxa"/>
-          <w:bottom w:w="0" w:type="dxa"/>
-          <w:right w:w="0" w:type="dxa"/>
         </w:tblCellMar>
         <w:tblLook w:val="04A0" w:firstRow="1" w:lastRow="0" w:firstColumn="1" w:lastColumn="0" w:noHBand="0" w:noVBand="1"/>
       </w:tblPr>
@@ -21642,68 +22077,68 @@
         <w:rPr>
           <w:b/>
         </w:rPr>
+        <w:t>bestpacker</w:t>
+      </w:r>
+      <w:proofErr w:type="spellEnd"/>
+      <w:r>
+        <w:rPr>
+          <w:b/>
+        </w:rPr>
+        <w:t xml:space="preserve"> [-</w:t>
+      </w:r>
+      <w:proofErr w:type="spellStart"/>
+      <w:r>
+        <w:rPr>
+          <w:b/>
+        </w:rPr>
+        <w:t>maxsize</w:t>
+      </w:r>
+      <w:proofErr w:type="spellEnd"/>
+      <w:r>
+        <w:rPr>
+          <w:b/>
+        </w:rPr>
+        <w:t xml:space="preserve"> &lt;n&gt;] [-</w:t>
+      </w:r>
+      <w:proofErr w:type="spellStart"/>
+      <w:r>
+        <w:rPr>
+          <w:b/>
+        </w:rPr>
+        <w:t>args</w:t>
+      </w:r>
+      <w:proofErr w:type="spellEnd"/>
+      <w:r>
+        <w:rPr>
+          <w:b/>
+        </w:rPr>
+        <w:t xml:space="preserve"> "&lt;</w:t>
+      </w:r>
+      <w:proofErr w:type="spellStart"/>
+      <w:r>
+        <w:rPr>
+          <w:b/>
+        </w:rPr>
+        <w:t>args</w:t>
+      </w:r>
+      <w:proofErr w:type="spellEnd"/>
+      <w:r>
+        <w:rPr>
+          <w:b/>
+        </w:rPr>
+        <w:t xml:space="preserve"> for vgmcomp2&gt;"] filename1 filename2 [...]</w:t>
+      </w:r>
+      <w:r>
+        <w:t xml:space="preserve">  </w:t>
+      </w:r>
+    </w:p>
+    <w:p>
+      <w:pPr>
+        <w:spacing w:after="0"/>
+        <w:ind w:left="9" w:right="13"/>
+      </w:pPr>
+      <w:r>
         <w:lastRenderedPageBreak/>
-        <w:t>bestpacker</w:t>
-      </w:r>
-      <w:proofErr w:type="spellEnd"/>
-      <w:r>
-        <w:rPr>
-          <w:b/>
-        </w:rPr>
-        <w:t xml:space="preserve"> [-</w:t>
-      </w:r>
-      <w:proofErr w:type="spellStart"/>
-      <w:r>
-        <w:rPr>
-          <w:b/>
-        </w:rPr>
-        <w:t>maxsize</w:t>
-      </w:r>
-      <w:proofErr w:type="spellEnd"/>
-      <w:r>
-        <w:rPr>
-          <w:b/>
-        </w:rPr>
-        <w:t xml:space="preserve"> &lt;n&gt;] [-</w:t>
-      </w:r>
-      <w:proofErr w:type="spellStart"/>
-      <w:r>
-        <w:rPr>
-          <w:b/>
-        </w:rPr>
-        <w:t>args</w:t>
-      </w:r>
-      <w:proofErr w:type="spellEnd"/>
-      <w:r>
-        <w:rPr>
-          <w:b/>
-        </w:rPr>
-        <w:t xml:space="preserve"> "&lt;</w:t>
-      </w:r>
-      <w:proofErr w:type="spellStart"/>
-      <w:r>
-        <w:rPr>
-          <w:b/>
-        </w:rPr>
-        <w:t>args</w:t>
-      </w:r>
-      <w:proofErr w:type="spellEnd"/>
-      <w:r>
-        <w:rPr>
-          <w:b/>
-        </w:rPr>
-        <w:t xml:space="preserve"> for vgmcomp2&gt;"] filename1 filename2 [...]</w:t>
-      </w:r>
-      <w:r>
-        <w:t xml:space="preserve">  </w:t>
-      </w:r>
-    </w:p>
-    <w:p>
-      <w:pPr>
-        <w:spacing w:after="0"/>
-        <w:ind w:left="9" w:right="13"/>
-      </w:pPr>
-      <w:r>
         <w:t xml:space="preserve">Takes in the list of filenames, and tries them all against vgmcomp2 to find the best combination for </w:t>
       </w:r>
       <w:proofErr w:type="spellStart"/>
@@ -22398,64 +22833,64 @@
         <w:rPr>
           <w:rFonts w:ascii="Courier New" w:eastAsia="Courier New" w:hAnsi="Courier New" w:cs="Courier New"/>
         </w:rPr>
+        <w:t>Finished command string 'vgmcomp2 -</w:t>
+      </w:r>
+      <w:proofErr w:type="spellStart"/>
+      <w:r>
+        <w:rPr>
+          <w:rFonts w:ascii="Courier New" w:eastAsia="Courier New" w:hAnsi="Courier New" w:cs="Courier New"/>
+        </w:rPr>
+        <w:t>sn</w:t>
+      </w:r>
+      <w:proofErr w:type="spellEnd"/>
+      <w:r>
+        <w:rPr>
+          <w:rFonts w:ascii="Courier New" w:eastAsia="Courier New" w:hAnsi="Courier New" w:cs="Courier New"/>
+        </w:rPr>
+        <w:t xml:space="preserve"> </w:t>
+      </w:r>
+      <w:proofErr w:type="spellStart"/>
+      <w:r>
+        <w:rPr>
+          <w:rFonts w:ascii="Courier New" w:eastAsia="Courier New" w:hAnsi="Courier New" w:cs="Courier New"/>
+        </w:rPr>
+        <w:t>ab_psg.psgsn</w:t>
+      </w:r>
+      <w:proofErr w:type="spellEnd"/>
+      <w:r>
+        <w:rPr>
+          <w:rFonts w:ascii="Courier New" w:eastAsia="Courier New" w:hAnsi="Courier New" w:cs="Courier New"/>
+        </w:rPr>
+        <w:t xml:space="preserve"> </w:t>
+      </w:r>
+      <w:proofErr w:type="spellStart"/>
+      <w:r>
+        <w:rPr>
+          <w:rFonts w:ascii="Courier New" w:eastAsia="Courier New" w:hAnsi="Courier New" w:cs="Courier New"/>
+        </w:rPr>
+        <w:t>wb.psgsn</w:t>
+      </w:r>
+      <w:proofErr w:type="spellEnd"/>
+      <w:r>
+        <w:rPr>
+          <w:rFonts w:ascii="Courier New" w:eastAsia="Courier New" w:hAnsi="Courier New" w:cs="Courier New"/>
+        </w:rPr>
+        <w:t>' with best size 6584 bytes</w:t>
+      </w:r>
+      <w:r>
+        <w:t xml:space="preserve">  </w:t>
+      </w:r>
+    </w:p>
+    <w:p>
+      <w:pPr>
+        <w:spacing w:after="104" w:line="270" w:lineRule="auto"/>
+        <w:ind w:left="19" w:hanging="10"/>
+      </w:pPr>
+      <w:r>
+        <w:rPr>
+          <w:rFonts w:ascii="Courier New" w:eastAsia="Courier New" w:hAnsi="Courier New" w:cs="Courier New"/>
+        </w:rPr>
         <w:lastRenderedPageBreak/>
-        <w:t>Finished command string 'vgmcomp2 -</w:t>
-      </w:r>
-      <w:proofErr w:type="spellStart"/>
-      <w:r>
-        <w:rPr>
-          <w:rFonts w:ascii="Courier New" w:eastAsia="Courier New" w:hAnsi="Courier New" w:cs="Courier New"/>
-        </w:rPr>
-        <w:t>sn</w:t>
-      </w:r>
-      <w:proofErr w:type="spellEnd"/>
-      <w:r>
-        <w:rPr>
-          <w:rFonts w:ascii="Courier New" w:eastAsia="Courier New" w:hAnsi="Courier New" w:cs="Courier New"/>
-        </w:rPr>
-        <w:t xml:space="preserve"> </w:t>
-      </w:r>
-      <w:proofErr w:type="spellStart"/>
-      <w:r>
-        <w:rPr>
-          <w:rFonts w:ascii="Courier New" w:eastAsia="Courier New" w:hAnsi="Courier New" w:cs="Courier New"/>
-        </w:rPr>
-        <w:t>ab_psg.psgsn</w:t>
-      </w:r>
-      <w:proofErr w:type="spellEnd"/>
-      <w:r>
-        <w:rPr>
-          <w:rFonts w:ascii="Courier New" w:eastAsia="Courier New" w:hAnsi="Courier New" w:cs="Courier New"/>
-        </w:rPr>
-        <w:t xml:space="preserve"> </w:t>
-      </w:r>
-      <w:proofErr w:type="spellStart"/>
-      <w:r>
-        <w:rPr>
-          <w:rFonts w:ascii="Courier New" w:eastAsia="Courier New" w:hAnsi="Courier New" w:cs="Courier New"/>
-        </w:rPr>
-        <w:t>wb.psgsn</w:t>
-      </w:r>
-      <w:proofErr w:type="spellEnd"/>
-      <w:r>
-        <w:rPr>
-          <w:rFonts w:ascii="Courier New" w:eastAsia="Courier New" w:hAnsi="Courier New" w:cs="Courier New"/>
-        </w:rPr>
-        <w:t>' with best size 6584 bytes</w:t>
-      </w:r>
-      <w:r>
-        <w:t xml:space="preserve">  </w:t>
-      </w:r>
-    </w:p>
-    <w:p>
-      <w:pPr>
-        <w:spacing w:after="104" w:line="270" w:lineRule="auto"/>
-        <w:ind w:left="19" w:hanging="10"/>
-      </w:pPr>
-      <w:r>
-        <w:rPr>
-          <w:rFonts w:ascii="Courier New" w:eastAsia="Courier New" w:hAnsi="Courier New" w:cs="Courier New"/>
-        </w:rPr>
         <w:t>Testing splash30.psgsn (with 0 files left)...</w:t>
       </w:r>
       <w:r>
@@ -22841,8 +23276,11 @@
         <w:ind w:right="13" w:hanging="360"/>
       </w:pPr>
       <w:r>
+        <w:t xml:space="preserve">This particular file output a warning about “47 mutes mapped” - all this means is that there were channels currently muted, but they changed their frequency. To improve </w:t>
+      </w:r>
+      <w:r>
         <w:lastRenderedPageBreak/>
-        <w:t xml:space="preserve">This particular file output a warning about “47 mutes mapped” - all this means is that there were channels currently muted, but they changed their frequency. To improve compression, that change was discarded until it was needed, if ever. The report will tell you if any changes were ‘lossy’, meaning the output quality is affected. In all cases you can use other tools to control how those lossy values are handled - the prepare tool will use the most heavy handed mapping available to it. -  </w:t>
+        <w:t xml:space="preserve">compression, that change was discarded until it was needed, if ever. The report will tell you if any changes were ‘lossy’, meaning the output quality is affected. In all cases you can use other tools to control how those lossy values are handled - the prepare tool will use the most heavy handed mapping available to it. -  </w:t>
       </w:r>
       <w:r>
         <w:tab/>
@@ -25561,6 +25999,7 @@
   <w:style w:type="paragraph" w:default="1" w:styleId="Normal">
     <w:name w:val="Normal"/>
     <w:qFormat/>
+    <w:rsid w:val="00690F56"/>
     <w:pPr>
       <w:spacing w:after="316" w:line="300" w:lineRule="auto"/>
       <w:ind w:left="14"/>

</xml_diff>